<commit_message>
Added literature review and started sourcing additional datasets
</commit_message>
<xml_diff>
--- a/report/Group D Project Plan.docx
+++ b/report/Group D Project Plan.docx
@@ -1,16 +1,20 @@
 
 <file path=word/document.xml><?xml version="1.0" encoding="utf-8"?>
-<w:document xmlns:wpc="http://schemas.microsoft.com/office/word/2010/wordprocessingCanvas" xmlns:cx="http://schemas.microsoft.com/office/drawing/2014/chartex" xmlns:cx1="http://schemas.microsoft.com/office/drawing/2015/9/8/chartex" xmlns:cx2="http://schemas.microsoft.com/office/drawing/2015/10/21/chartex" xmlns:cx3="http://schemas.microsoft.com/office/drawing/2016/5/9/chartex" xmlns:cx4="http://schemas.microsoft.com/office/drawing/2016/5/10/chartex" xmlns:cx5="http://schemas.microsoft.com/office/drawing/2016/5/11/chartex" xmlns:cx6="http://schemas.microsoft.com/office/drawing/2016/5/12/chartex" xmlns:cx7="http://schemas.microsoft.com/office/drawing/2016/5/13/chartex" xmlns:cx8="http://schemas.microsoft.com/office/drawing/2016/5/14/chartex" xmlns:mc="http://schemas.openxmlformats.org/markup-compatibility/2006" xmlns:aink="http://schemas.microsoft.com/office/drawing/2016/ink" xmlns:am3d="http://schemas.microsoft.com/office/drawing/2017/model3d" xmlns:o="urn:schemas-microsoft-com:office:office" xmlns:oel="http://schemas.microsoft.com/office/2019/extlst" xmlns:r="http://schemas.openxmlformats.org/officeDocument/2006/relationships" xmlns:m="http://schemas.openxmlformats.org/officeDocument/2006/math" xmlns:v="urn:schemas-microsoft-com:vml" xmlns:wp14="http://schemas.microsoft.com/office/word/2010/wordprocessingDrawing" xmlns:wp="http://schemas.openxmlformats.org/drawingml/2006/wordprocessingDrawing" xmlns:w10="urn:schemas-microsoft-com:office:word" xmlns:w="http://schemas.openxmlformats.org/wordprocessingml/2006/main" xmlns:w14="http://schemas.microsoft.com/office/word/2010/wordml" xmlns:w15="http://schemas.microsoft.com/office/word/2012/wordml" xmlns:w16cei="http://schemas.microsoft.com/office/word/2026/wordml/cei" xmlns:w16cex="http://schemas.microsoft.com/office/word/2018/wordml/cex" xmlns:w16cid="http://schemas.microsoft.com/office/word/2016/wordml/cid" xmlns:w16="http://schemas.microsoft.com/office/word/2018/wordml" xmlns:w16du="http://schemas.microsoft.com/office/word/2023/wordml/word16du" xmlns:w16sdtdh="http://schemas.microsoft.com/office/word/2020/wordml/sdtdatahash" xmlns:w16sdtfl="http://schemas.microsoft.com/office/word/2024/wordml/sdtformatlock" xmlns:w16se="http://schemas.microsoft.com/office/word/2015/wordml/symex" xmlns:wpg="http://schemas.microsoft.com/office/word/2010/wordprocessingGroup" xmlns:wpi="http://schemas.microsoft.com/office/word/2010/wordprocessingInk" xmlns:wne="http://schemas.microsoft.com/office/word/2006/wordml" xmlns:wps="http://schemas.microsoft.com/office/word/2010/wordprocessingShape" mc:Ignorable="w14 w15 w16se w16cid w16 w16cex w16sdtdh w16sdtfl w16du wp14">
+<w:document xmlns:wpc="http://schemas.microsoft.com/office/word/2010/wordprocessingCanvas" xmlns:cx="http://schemas.microsoft.com/office/drawing/2014/chartex" xmlns:cx1="http://schemas.microsoft.com/office/drawing/2015/9/8/chartex" xmlns:cx2="http://schemas.microsoft.com/office/drawing/2015/10/21/chartex" xmlns:cx3="http://schemas.microsoft.com/office/drawing/2016/5/9/chartex" xmlns:cx4="http://schemas.microsoft.com/office/drawing/2016/5/10/chartex" xmlns:cx5="http://schemas.microsoft.com/office/drawing/2016/5/11/chartex" xmlns:cx6="http://schemas.microsoft.com/office/drawing/2016/5/12/chartex" xmlns:cx7="http://schemas.microsoft.com/office/drawing/2016/5/13/chartex" xmlns:cx8="http://schemas.microsoft.com/office/drawing/2016/5/14/chartex" xmlns:mc="http://schemas.openxmlformats.org/markup-compatibility/2006" xmlns:aink="http://schemas.microsoft.com/office/drawing/2016/ink" xmlns:am3d="http://schemas.microsoft.com/office/drawing/2017/model3d" xmlns:o="urn:schemas-microsoft-com:office:office" xmlns:oel="http://schemas.microsoft.com/office/2019/extlst" xmlns:r="http://schemas.openxmlformats.org/officeDocument/2006/relationships" xmlns:m="http://schemas.openxmlformats.org/officeDocument/2006/math" xmlns:v="urn:schemas-microsoft-com:vml" xmlns:wp14="http://schemas.microsoft.com/office/word/2010/wordprocessingDrawing" xmlns:wp="http://schemas.openxmlformats.org/drawingml/2006/wordprocessingDrawing" xmlns:w10="urn:schemas-microsoft-com:office:word" xmlns:w="http://schemas.openxmlformats.org/wordprocessingml/2006/main" xmlns:w14="http://schemas.microsoft.com/office/word/2010/wordml" xmlns:w15="http://schemas.microsoft.com/office/word/2012/wordml" xmlns:w16cex="http://schemas.microsoft.com/office/word/2018/wordml/cex" xmlns:w16cid="http://schemas.microsoft.com/office/word/2016/wordml/cid" xmlns:w16="http://schemas.microsoft.com/office/word/2018/wordml" xmlns:w16du="http://schemas.microsoft.com/office/word/2023/wordml/word16du" xmlns:w16sdtdh="http://schemas.microsoft.com/office/word/2020/wordml/sdtdatahash" xmlns:w16sdtfl="http://schemas.microsoft.com/office/word/2024/wordml/sdtformatlock" xmlns:w16se="http://schemas.microsoft.com/office/word/2015/wordml/symex" xmlns:wpg="http://schemas.microsoft.com/office/word/2010/wordprocessingGroup" xmlns:wpi="http://schemas.microsoft.com/office/word/2010/wordprocessingInk" xmlns:wne="http://schemas.microsoft.com/office/word/2006/wordml" xmlns:wps="http://schemas.microsoft.com/office/word/2010/wordprocessingShape" mc:Ignorable="w14 w15 w16se w16cid w16 w16cex w16sdtdh w16sdtfl w16du wp14">
   <w:body>
     <w:p>
       <w:pPr>
         <w:spacing w:before="1400"/>
+        <w:rPr>
+          <w:lang w:val="en-AU"/>
+        </w:rPr>
       </w:pPr>
       <w:r>
         <w:rPr>
           <w:b/>
           <w:color w:val="00A6A6"/>
           <w:sz w:val="24"/>
+          <w:lang w:val="en-AU"/>
         </w:rPr>
         <w:t>GROUP PROJECT PLAN</w:t>
       </w:r>
@@ -18,16 +22,28 @@
     <w:p>
       <w:pPr>
         <w:pStyle w:val="Title"/>
-      </w:pPr>
-      <w:r>
+        <w:rPr>
+          <w:lang w:val="en-AU"/>
+        </w:rPr>
+      </w:pPr>
+      <w:r>
+        <w:rPr>
+          <w:lang w:val="en-AU"/>
+        </w:rPr>
         <w:t>Rooftop Solar Variability and Short-Term Grid Demand</w:t>
       </w:r>
     </w:p>
     <w:p>
+      <w:pPr>
+        <w:rPr>
+          <w:lang w:val="en-AU"/>
+        </w:rPr>
+      </w:pPr>
       <w:r>
         <w:rPr>
           <w:color w:val="64748B"/>
           <w:sz w:val="26"/>
+          <w:lang w:val="en-AU"/>
         </w:rPr>
         <w:t>A data science study of how distributed rooftop PV output reshapes operational demand in Australia’s National Electricity Market</w:t>
       </w:r>
@@ -56,16 +72,21 @@
           <w:p>
             <w:pPr>
               <w:spacing w:after="0"/>
-            </w:pPr>
-            <w:r>
-              <w:rPr>
-                <w:color w:val="1F2937"/>
+              <w:rPr>
+                <w:lang w:val="en-AU"/>
+              </w:rPr>
+            </w:pPr>
+            <w:r>
+              <w:rPr>
+                <w:color w:val="1F2937"/>
+                <w:lang w:val="en-AU"/>
               </w:rPr>
               <w:t>RESEARCH QUESTION</w:t>
             </w:r>
             <w:r>
               <w:rPr>
                 <w:color w:val="1F2937"/>
+                <w:lang w:val="en-AU"/>
               </w:rPr>
               <w:br/>
               <w:t>Quantify the impact of rooftop solar generation variability on grid demand across different times of the day and under varying weather conditions.</w:t>
@@ -74,7 +95,13 @@
         </w:tc>
       </w:tr>
     </w:tbl>
-    <w:p/>
+    <w:p>
+      <w:pPr>
+        <w:rPr>
+          <w:lang w:val="en-AU"/>
+        </w:rPr>
+      </w:pPr>
+    </w:p>
     <w:tbl>
       <w:tblPr>
         <w:tblW w:w="0" w:type="auto"/>
@@ -106,11 +133,15 @@
             <w:pPr>
               <w:spacing w:after="0"/>
               <w:jc w:val="center"/>
+              <w:rPr>
+                <w:lang w:val="en-AU"/>
+              </w:rPr>
             </w:pPr>
             <w:r>
               <w:rPr>
                 <w:b/>
                 <w:color w:val="FFFFFF"/>
+                <w:lang w:val="en-AU"/>
               </w:rPr>
               <w:t>Field</w:t>
             </w:r>
@@ -132,11 +163,15 @@
             <w:pPr>
               <w:spacing w:after="0"/>
               <w:jc w:val="center"/>
+              <w:rPr>
+                <w:lang w:val="en-AU"/>
+              </w:rPr>
             </w:pPr>
             <w:r>
               <w:rPr>
                 <w:b/>
                 <w:color w:val="FFFFFF"/>
+                <w:lang w:val="en-AU"/>
               </w:rPr>
               <w:t>Details</w:t>
             </w:r>
@@ -162,10 +197,14 @@
           <w:p>
             <w:pPr>
               <w:spacing w:after="0"/>
-            </w:pPr>
-            <w:r>
-              <w:rPr>
-                <w:color w:val="1F2937"/>
+              <w:rPr>
+                <w:lang w:val="en-AU"/>
+              </w:rPr>
+            </w:pPr>
+            <w:r>
+              <w:rPr>
+                <w:color w:val="1F2937"/>
+                <w:lang w:val="en-AU"/>
               </w:rPr>
               <w:t>Course</w:t>
             </w:r>
@@ -186,10 +225,14 @@
           <w:p>
             <w:pPr>
               <w:spacing w:after="0"/>
-            </w:pPr>
-            <w:r>
-              <w:rPr>
-                <w:color w:val="1F2937"/>
+              <w:rPr>
+                <w:lang w:val="en-AU"/>
+              </w:rPr>
+            </w:pPr>
+            <w:r>
+              <w:rPr>
+                <w:color w:val="1F2937"/>
+                <w:lang w:val="en-AU"/>
               </w:rPr>
               <w:t>ZZSC9020</w:t>
             </w:r>
@@ -215,10 +258,14 @@
           <w:p>
             <w:pPr>
               <w:spacing w:after="0"/>
-            </w:pPr>
-            <w:r>
-              <w:rPr>
-                <w:color w:val="1F2937"/>
+              <w:rPr>
+                <w:lang w:val="en-AU"/>
+              </w:rPr>
+            </w:pPr>
+            <w:r>
+              <w:rPr>
+                <w:color w:val="1F2937"/>
+                <w:lang w:val="en-AU"/>
               </w:rPr>
               <w:t>Team</w:t>
             </w:r>
@@ -239,10 +286,14 @@
           <w:p>
             <w:pPr>
               <w:spacing w:after="0"/>
-            </w:pPr>
-            <w:r>
-              <w:rPr>
-                <w:color w:val="1F2937"/>
+              <w:rPr>
+                <w:lang w:val="en-AU"/>
+              </w:rPr>
+            </w:pPr>
+            <w:r>
+              <w:rPr>
+                <w:color w:val="1F2937"/>
+                <w:lang w:val="en-AU"/>
               </w:rPr>
               <w:t>Group D</w:t>
             </w:r>
@@ -268,10 +319,14 @@
           <w:p>
             <w:pPr>
               <w:spacing w:after="0"/>
-            </w:pPr>
-            <w:r>
-              <w:rPr>
-                <w:color w:val="1F2937"/>
+              <w:rPr>
+                <w:lang w:val="en-AU"/>
+              </w:rPr>
+            </w:pPr>
+            <w:r>
+              <w:rPr>
+                <w:color w:val="1F2937"/>
+                <w:lang w:val="en-AU"/>
               </w:rPr>
               <w:t>Members</w:t>
             </w:r>
@@ -292,47 +347,85 @@
           <w:p>
             <w:pPr>
               <w:spacing w:after="0"/>
-            </w:pPr>
-            <w:r>
-              <w:rPr>
-                <w:color w:val="1F2937"/>
+              <w:rPr>
+                <w:lang w:val="en-AU"/>
+              </w:rPr>
+            </w:pPr>
+            <w:r>
+              <w:rPr>
+                <w:color w:val="1F2937"/>
+                <w:lang w:val="en-AU"/>
               </w:rPr>
               <w:t>Bel Zhou (z</w:t>
             </w:r>
             <w:r>
               <w:rPr>
                 <w:color w:val="1F2937"/>
+                <w:lang w:val="en-AU"/>
               </w:rPr>
               <w:t>5537223</w:t>
             </w:r>
             <w:r>
               <w:rPr>
                 <w:color w:val="1F2937"/>
-              </w:rPr>
-              <w:t>); [M</w:t>
-            </w:r>
-            <w:r>
-              <w:rPr>
-                <w:color w:val="1F2937"/>
-              </w:rPr>
-              <w:t>ember 2</w:t>
-            </w:r>
-            <w:r>
-              <w:rPr>
-                <w:color w:val="1F2937"/>
-              </w:rPr>
-              <w:t>]</w:t>
-            </w:r>
-            <w:r>
-              <w:rPr>
-                <w:color w:val="1F2937"/>
+                <w:lang w:val="en-AU"/>
+              </w:rPr>
+              <w:t xml:space="preserve">); </w:t>
+            </w:r>
+            <w:r>
+              <w:rPr>
+                <w:color w:val="1F2937"/>
+                <w:lang w:val="en-AU"/>
+              </w:rPr>
+              <w:t>Anders Appel</w:t>
+            </w:r>
+            <w:r>
+              <w:rPr>
+                <w:color w:val="1F2937"/>
+                <w:lang w:val="en-AU"/>
               </w:rPr>
               <w:t xml:space="preserve"> (</w:t>
             </w:r>
+            <w:r>
+              <w:rPr>
+                <w:color w:val="1F2937"/>
+                <w:lang w:val="en-AU"/>
+              </w:rPr>
+              <w:t>z556897</w:t>
+            </w:r>
+            <w:r>
+              <w:rPr>
+                <w:color w:val="1F2937"/>
+                <w:lang w:val="en-AU"/>
+              </w:rPr>
+              <w:t>8</w:t>
+            </w:r>
+            <w:r>
+              <w:rPr>
+                <w:color w:val="1F2937"/>
+                <w:lang w:val="en-AU"/>
+              </w:rPr>
+              <w:t>)</w:t>
+            </w:r>
+            <w:r>
+              <w:rPr>
+                <w:color w:val="1F2937"/>
+                <w:lang w:val="en-AU"/>
+              </w:rPr>
+              <w:t>; [Member 3]</w:t>
+            </w:r>
+            <w:r>
+              <w:rPr>
+                <w:color w:val="1F2937"/>
+                <w:lang w:val="en-AU"/>
+              </w:rPr>
+              <w:t xml:space="preserve"> (</w:t>
+            </w:r>
             <w:proofErr w:type="spellStart"/>
             <w:r>
               <w:rPr>
                 <w:color w:val="1F2937"/>
+                <w:lang w:val="en-AU"/>
               </w:rPr>
               <w:t>zid</w:t>
             </w:r>
@@ -340,32 +433,7 @@
             <w:r>
               <w:rPr>
                 <w:color w:val="1F2937"/>
-              </w:rPr>
-              <w:t>)</w:t>
-            </w:r>
-            <w:r>
-              <w:rPr>
-                <w:color w:val="1F2937"/>
-              </w:rPr>
-              <w:t>; [Member 3]</w:t>
-            </w:r>
-            <w:r>
-              <w:rPr>
-                <w:color w:val="1F2937"/>
-              </w:rPr>
-              <w:t xml:space="preserve"> (</w:t>
-            </w:r>
-            <w:proofErr w:type="spellStart"/>
-            <w:r>
-              <w:rPr>
-                <w:color w:val="1F2937"/>
-              </w:rPr>
-              <w:t>zid</w:t>
-            </w:r>
-            <w:proofErr w:type="spellEnd"/>
-            <w:r>
-              <w:rPr>
-                <w:color w:val="1F2937"/>
+                <w:lang w:val="en-AU"/>
               </w:rPr>
               <w:t>)</w:t>
             </w:r>
@@ -373,8 +441,20 @@
         </w:tc>
       </w:tr>
     </w:tbl>
-    <w:p/>
-    <w:p/>
+    <w:p>
+      <w:pPr>
+        <w:rPr>
+          <w:lang w:val="en-AU"/>
+        </w:rPr>
+      </w:pPr>
+    </w:p>
+    <w:p>
+      <w:pPr>
+        <w:rPr>
+          <w:lang w:val="en-AU"/>
+        </w:rPr>
+      </w:pPr>
+    </w:p>
     <w:sdt>
       <w:sdtPr>
         <w:rPr>
@@ -382,6 +462,7 @@
           <w:color w:val="auto"/>
           <w:sz w:val="24"/>
           <w:szCs w:val="24"/>
+          <w:lang w:val="en-AU"/>
         </w:rPr>
         <w:id w:val="-1230846416"/>
         <w:docPartObj>
@@ -399,8 +480,14 @@
         <w:p>
           <w:pPr>
             <w:pStyle w:val="TOCHeading"/>
+            <w:rPr>
+              <w:lang w:val="en-AU"/>
+            </w:rPr>
           </w:pPr>
           <w:r>
+            <w:rPr>
+              <w:lang w:val="en-AU"/>
+            </w:rPr>
             <w:t>Table of Contents</w:t>
           </w:r>
         </w:p>
@@ -413,15 +500,25 @@
             </w:tabs>
             <w:rPr>
               <w:noProof/>
+              <w:lang w:val="en-AU"/>
             </w:rPr>
           </w:pPr>
           <w:r>
+            <w:rPr>
+              <w:lang w:val="en-AU"/>
+            </w:rPr>
             <w:fldChar w:fldCharType="begin"/>
           </w:r>
           <w:r>
+            <w:rPr>
+              <w:lang w:val="en-AU"/>
+            </w:rPr>
             <w:instrText>TOC \o "1-2" \h \z \u</w:instrText>
           </w:r>
           <w:r>
+            <w:rPr>
+              <w:lang w:val="en-AU"/>
+            </w:rPr>
             <w:fldChar w:fldCharType="separate"/>
           </w:r>
           <w:hyperlink w:anchor="_Toc239509546" w:history="1">
@@ -429,12 +526,14 @@
               <w:rPr>
                 <w:rStyle w:val="Hyperlink"/>
                 <w:noProof/>
+                <w:lang w:val="en-AU"/>
               </w:rPr>
               <w:t>1.</w:t>
             </w:r>
             <w:r>
               <w:rPr>
                 <w:noProof/>
+                <w:lang w:val="en-AU"/>
               </w:rPr>
               <w:tab/>
             </w:r>
@@ -442,6 +541,7 @@
               <w:rPr>
                 <w:rStyle w:val="Hyperlink"/>
                 <w:noProof/>
+                <w:lang w:val="en-AU"/>
               </w:rPr>
               <w:t>Introduction and Motivation</w:t>
             </w:r>
@@ -449,6 +549,7 @@
               <w:rPr>
                 <w:noProof/>
                 <w:webHidden/>
+                <w:lang w:val="en-AU"/>
               </w:rPr>
               <w:tab/>
             </w:r>
@@ -456,6 +557,7 @@
               <w:rPr>
                 <w:noProof/>
                 <w:webHidden/>
+                <w:lang w:val="en-AU"/>
               </w:rPr>
               <w:fldChar w:fldCharType="begin"/>
             </w:r>
@@ -463,6 +565,7 @@
               <w:rPr>
                 <w:noProof/>
                 <w:webHidden/>
+                <w:lang w:val="en-AU"/>
               </w:rPr>
               <w:instrText xml:space="preserve"> PAGEREF _Toc239509546 \h </w:instrText>
             </w:r>
@@ -470,12 +573,14 @@
               <w:rPr>
                 <w:noProof/>
                 <w:webHidden/>
+                <w:lang w:val="en-AU"/>
               </w:rPr>
             </w:r>
             <w:r>
               <w:rPr>
                 <w:noProof/>
                 <w:webHidden/>
+                <w:lang w:val="en-AU"/>
               </w:rPr>
               <w:fldChar w:fldCharType="separate"/>
             </w:r>
@@ -483,6 +588,7 @@
               <w:rPr>
                 <w:noProof/>
                 <w:webHidden/>
+                <w:lang w:val="en-AU"/>
               </w:rPr>
               <w:t>1</w:t>
             </w:r>
@@ -490,6 +596,7 @@
               <w:rPr>
                 <w:noProof/>
                 <w:webHidden/>
+                <w:lang w:val="en-AU"/>
               </w:rPr>
               <w:fldChar w:fldCharType="end"/>
             </w:r>
@@ -504,6 +611,7 @@
             </w:tabs>
             <w:rPr>
               <w:noProof/>
+              <w:lang w:val="en-AU"/>
             </w:rPr>
           </w:pPr>
           <w:hyperlink w:anchor="_Toc239509547" w:history="1">
@@ -511,12 +619,14 @@
               <w:rPr>
                 <w:rStyle w:val="Hyperlink"/>
                 <w:noProof/>
+                <w:lang w:val="en-AU"/>
               </w:rPr>
               <w:t>2.</w:t>
             </w:r>
             <w:r>
               <w:rPr>
                 <w:noProof/>
+                <w:lang w:val="en-AU"/>
               </w:rPr>
               <w:tab/>
             </w:r>
@@ -524,6 +634,7 @@
               <w:rPr>
                 <w:rStyle w:val="Hyperlink"/>
                 <w:noProof/>
+                <w:lang w:val="en-AU"/>
               </w:rPr>
               <w:t>Brief Literature Review</w:t>
             </w:r>
@@ -531,6 +642,7 @@
               <w:rPr>
                 <w:noProof/>
                 <w:webHidden/>
+                <w:lang w:val="en-AU"/>
               </w:rPr>
               <w:tab/>
             </w:r>
@@ -538,6 +650,7 @@
               <w:rPr>
                 <w:noProof/>
                 <w:webHidden/>
+                <w:lang w:val="en-AU"/>
               </w:rPr>
               <w:fldChar w:fldCharType="begin"/>
             </w:r>
@@ -545,6 +658,7 @@
               <w:rPr>
                 <w:noProof/>
                 <w:webHidden/>
+                <w:lang w:val="en-AU"/>
               </w:rPr>
               <w:instrText xml:space="preserve"> PAGEREF _Toc239509547 \h </w:instrText>
             </w:r>
@@ -552,12 +666,14 @@
               <w:rPr>
                 <w:noProof/>
                 <w:webHidden/>
+                <w:lang w:val="en-AU"/>
               </w:rPr>
             </w:r>
             <w:r>
               <w:rPr>
                 <w:noProof/>
                 <w:webHidden/>
+                <w:lang w:val="en-AU"/>
               </w:rPr>
               <w:fldChar w:fldCharType="separate"/>
             </w:r>
@@ -565,6 +681,7 @@
               <w:rPr>
                 <w:noProof/>
                 <w:webHidden/>
+                <w:lang w:val="en-AU"/>
               </w:rPr>
               <w:t>1</w:t>
             </w:r>
@@ -572,6 +689,7 @@
               <w:rPr>
                 <w:noProof/>
                 <w:webHidden/>
+                <w:lang w:val="en-AU"/>
               </w:rPr>
               <w:fldChar w:fldCharType="end"/>
             </w:r>
@@ -586,6 +704,7 @@
             </w:tabs>
             <w:rPr>
               <w:noProof/>
+              <w:lang w:val="en-AU"/>
             </w:rPr>
           </w:pPr>
           <w:hyperlink w:anchor="_Toc239509548" w:history="1">
@@ -593,12 +712,14 @@
               <w:rPr>
                 <w:rStyle w:val="Hyperlink"/>
                 <w:noProof/>
+                <w:lang w:val="en-AU"/>
               </w:rPr>
               <w:t>3.</w:t>
             </w:r>
             <w:r>
               <w:rPr>
                 <w:noProof/>
+                <w:lang w:val="en-AU"/>
               </w:rPr>
               <w:tab/>
             </w:r>
@@ -606,6 +727,7 @@
               <w:rPr>
                 <w:rStyle w:val="Hyperlink"/>
                 <w:noProof/>
+                <w:lang w:val="en-AU"/>
               </w:rPr>
               <w:t>Methods, Software and Data Description</w:t>
             </w:r>
@@ -613,6 +735,7 @@
               <w:rPr>
                 <w:noProof/>
                 <w:webHidden/>
+                <w:lang w:val="en-AU"/>
               </w:rPr>
               <w:tab/>
             </w:r>
@@ -620,6 +743,7 @@
               <w:rPr>
                 <w:noProof/>
                 <w:webHidden/>
+                <w:lang w:val="en-AU"/>
               </w:rPr>
               <w:fldChar w:fldCharType="begin"/>
             </w:r>
@@ -627,6 +751,7 @@
               <w:rPr>
                 <w:noProof/>
                 <w:webHidden/>
+                <w:lang w:val="en-AU"/>
               </w:rPr>
               <w:instrText xml:space="preserve"> PAGEREF _Toc239509548 \h </w:instrText>
             </w:r>
@@ -634,12 +759,14 @@
               <w:rPr>
                 <w:noProof/>
                 <w:webHidden/>
+                <w:lang w:val="en-AU"/>
               </w:rPr>
             </w:r>
             <w:r>
               <w:rPr>
                 <w:noProof/>
                 <w:webHidden/>
+                <w:lang w:val="en-AU"/>
               </w:rPr>
               <w:fldChar w:fldCharType="separate"/>
             </w:r>
@@ -647,6 +774,7 @@
               <w:rPr>
                 <w:noProof/>
                 <w:webHidden/>
+                <w:lang w:val="en-AU"/>
               </w:rPr>
               <w:t>1</w:t>
             </w:r>
@@ -654,6 +782,7 @@
               <w:rPr>
                 <w:noProof/>
                 <w:webHidden/>
+                <w:lang w:val="en-AU"/>
               </w:rPr>
               <w:fldChar w:fldCharType="end"/>
             </w:r>
@@ -668,6 +797,7 @@
             </w:tabs>
             <w:rPr>
               <w:noProof/>
+              <w:lang w:val="en-AU"/>
             </w:rPr>
           </w:pPr>
           <w:hyperlink w:anchor="_Toc239509549" w:history="1">
@@ -675,12 +805,14 @@
               <w:rPr>
                 <w:rStyle w:val="Hyperlink"/>
                 <w:noProof/>
+                <w:lang w:val="en-AU"/>
               </w:rPr>
               <w:t>4.</w:t>
             </w:r>
             <w:r>
               <w:rPr>
                 <w:noProof/>
+                <w:lang w:val="en-AU"/>
               </w:rPr>
               <w:tab/>
             </w:r>
@@ -688,6 +820,7 @@
               <w:rPr>
                 <w:rStyle w:val="Hyperlink"/>
                 <w:noProof/>
+                <w:lang w:val="en-AU"/>
               </w:rPr>
               <w:t>Activities and Schedule</w:t>
             </w:r>
@@ -695,6 +828,7 @@
               <w:rPr>
                 <w:noProof/>
                 <w:webHidden/>
+                <w:lang w:val="en-AU"/>
               </w:rPr>
               <w:tab/>
             </w:r>
@@ -702,6 +836,7 @@
               <w:rPr>
                 <w:noProof/>
                 <w:webHidden/>
+                <w:lang w:val="en-AU"/>
               </w:rPr>
               <w:fldChar w:fldCharType="begin"/>
             </w:r>
@@ -709,6 +844,7 @@
               <w:rPr>
                 <w:noProof/>
                 <w:webHidden/>
+                <w:lang w:val="en-AU"/>
               </w:rPr>
               <w:instrText xml:space="preserve"> PAGEREF _Toc239509549 \h </w:instrText>
             </w:r>
@@ -716,12 +852,14 @@
               <w:rPr>
                 <w:noProof/>
                 <w:webHidden/>
+                <w:lang w:val="en-AU"/>
               </w:rPr>
             </w:r>
             <w:r>
               <w:rPr>
                 <w:noProof/>
                 <w:webHidden/>
+                <w:lang w:val="en-AU"/>
               </w:rPr>
               <w:fldChar w:fldCharType="separate"/>
             </w:r>
@@ -729,6 +867,7 @@
               <w:rPr>
                 <w:noProof/>
                 <w:webHidden/>
+                <w:lang w:val="en-AU"/>
               </w:rPr>
               <w:t>1</w:t>
             </w:r>
@@ -736,6 +875,7 @@
               <w:rPr>
                 <w:noProof/>
                 <w:webHidden/>
+                <w:lang w:val="en-AU"/>
               </w:rPr>
               <w:fldChar w:fldCharType="end"/>
             </w:r>
@@ -749,6 +889,7 @@
             </w:tabs>
             <w:rPr>
               <w:noProof/>
+              <w:lang w:val="en-AU"/>
             </w:rPr>
           </w:pPr>
           <w:hyperlink w:anchor="_Toc239509550" w:history="1">
@@ -756,6 +897,7 @@
               <w:rPr>
                 <w:rStyle w:val="Hyperlink"/>
                 <w:noProof/>
+                <w:lang w:val="en-AU"/>
               </w:rPr>
               <w:t>References</w:t>
             </w:r>
@@ -763,6 +905,7 @@
               <w:rPr>
                 <w:noProof/>
                 <w:webHidden/>
+                <w:lang w:val="en-AU"/>
               </w:rPr>
               <w:tab/>
             </w:r>
@@ -770,6 +913,7 @@
               <w:rPr>
                 <w:noProof/>
                 <w:webHidden/>
+                <w:lang w:val="en-AU"/>
               </w:rPr>
               <w:fldChar w:fldCharType="begin"/>
             </w:r>
@@ -777,6 +921,7 @@
               <w:rPr>
                 <w:noProof/>
                 <w:webHidden/>
+                <w:lang w:val="en-AU"/>
               </w:rPr>
               <w:instrText xml:space="preserve"> PAGEREF _Toc239509550 \h </w:instrText>
             </w:r>
@@ -784,12 +929,14 @@
               <w:rPr>
                 <w:noProof/>
                 <w:webHidden/>
+                <w:lang w:val="en-AU"/>
               </w:rPr>
             </w:r>
             <w:r>
               <w:rPr>
                 <w:noProof/>
                 <w:webHidden/>
+                <w:lang w:val="en-AU"/>
               </w:rPr>
               <w:fldChar w:fldCharType="separate"/>
             </w:r>
@@ -797,6 +944,7 @@
               <w:rPr>
                 <w:noProof/>
                 <w:webHidden/>
+                <w:lang w:val="en-AU"/>
               </w:rPr>
               <w:t>1</w:t>
             </w:r>
@@ -804,34 +952,67 @@
               <w:rPr>
                 <w:noProof/>
                 <w:webHidden/>
+                <w:lang w:val="en-AU"/>
               </w:rPr>
               <w:fldChar w:fldCharType="end"/>
             </w:r>
           </w:hyperlink>
         </w:p>
         <w:p>
+          <w:pPr>
+            <w:rPr>
+              <w:lang w:val="en-AU"/>
+            </w:rPr>
+          </w:pPr>
           <w:r>
+            <w:rPr>
+              <w:lang w:val="en-AU"/>
+            </w:rPr>
             <w:fldChar w:fldCharType="end"/>
           </w:r>
         </w:p>
       </w:sdtContent>
     </w:sdt>
-    <w:p/>
-    <w:p/>
     <w:p>
-      <w:r>
-        <w:br w:type="page"/>
-      </w:r>
+      <w:pPr>
+        <w:rPr>
+          <w:lang w:val="en-AU"/>
+        </w:rPr>
+      </w:pPr>
     </w:p>
     <w:p>
       <w:pPr>
+        <w:rPr>
+          <w:lang w:val="en-AU"/>
+        </w:rPr>
+      </w:pPr>
+    </w:p>
+    <w:p>
+      <w:pPr>
+        <w:rPr>
+          <w:lang w:val="en-AU"/>
+        </w:rPr>
+      </w:pPr>
+      <w:r>
+        <w:rPr>
+          <w:lang w:val="en-AU"/>
+        </w:rPr>
+        <w:br w:type="page"/>
+      </w:r>
+    </w:p>
+    <w:p>
+      <w:pPr>
         <w:spacing w:after="40"/>
+        <w:rPr>
+          <w:lang w:val="en-AU"/>
+        </w:rPr>
       </w:pPr>
       <w:r>
         <w:rPr>
           <w:b/>
           <w:color w:val="00A6A6"/>
           <w:sz w:val="16"/>
+          <w:lang w:val="en-AU"/>
         </w:rPr>
         <w:lastRenderedPageBreak/>
         <w:t>PAGE 1 OF 3</w:t>
@@ -840,19 +1021,47 @@
     <w:p>
       <w:pPr>
         <w:pStyle w:val="Heading1"/>
-      </w:pPr>
-      <w:r>
+        <w:rPr>
+          <w:lang w:val="en-AU"/>
+        </w:rPr>
+      </w:pPr>
+      <w:r>
+        <w:rPr>
+          <w:lang w:val="en-AU"/>
+        </w:rPr>
         <w:t>1. Introduction and Motivation</w:t>
       </w:r>
     </w:p>
     <w:p>
-      <w:r>
+      <w:pPr>
+        <w:rPr>
+          <w:lang w:val="en-AU"/>
+        </w:rPr>
+      </w:pPr>
+      <w:r>
+        <w:rPr>
+          <w:lang w:val="en-AU"/>
+        </w:rPr>
         <w:t>Since rooftop solar generation happens behind the meter, more solar power at home means less electricity is pulled from the grid. This can make the midday dip in demand even deeper and cause much sharper spikes in the afternoon when solar production starts to drop off. Getting a handle on these quick shifts is essential for predicting demand, coordinating battery storage, and keeping the whole system running reliably.</w:t>
       </w:r>
     </w:p>
-    <w:p/>
     <w:p>
-      <w:r>
+      <w:pPr>
+        <w:rPr>
+          <w:lang w:val="en-AU"/>
+        </w:rPr>
+      </w:pPr>
+    </w:p>
+    <w:p>
+      <w:pPr>
+        <w:rPr>
+          <w:lang w:val="en-AU"/>
+        </w:rPr>
+      </w:pPr>
+      <w:r>
+        <w:rPr>
+          <w:lang w:val="en-AU"/>
+        </w:rPr>
         <w:t>This project aims to measure how half-hourly changes in estimated rooftop solar output relate to regional grid demand. We will look at how this connection changes depending on the time of day and the weather, all while accounting for regular patterns like the day of the week or the season.</w:t>
       </w:r>
     </w:p>
@@ -882,11 +1091,13 @@
               <w:spacing w:after="0"/>
               <w:rPr>
                 <w:color w:val="1F2937"/>
-              </w:rPr>
-            </w:pPr>
-            <w:r>
-              <w:rPr>
-                <w:color w:val="1F2937"/>
+                <w:lang w:val="en-AU"/>
+              </w:rPr>
+            </w:pPr>
+            <w:r>
+              <w:rPr>
+                <w:color w:val="1F2937"/>
+                <w:lang w:val="en-AU"/>
               </w:rPr>
               <w:t>PROJECT OBJECTIVE</w:t>
             </w:r>
@@ -894,14 +1105,26 @@
           <w:p>
             <w:pPr>
               <w:spacing w:after="0"/>
-            </w:pPr>
-            <w:r>
+              <w:rPr>
+                <w:lang w:val="en-AU"/>
+              </w:rPr>
+            </w:pPr>
+            <w:r>
+              <w:rPr>
+                <w:lang w:val="en-AU"/>
+              </w:rPr>
               <w:t xml:space="preserve">Create a reproducible Python workflow to profile, model, and visualize the short-term link between solar variability and grid demand, </w:t>
             </w:r>
             <w:r>
+              <w:rPr>
+                <w:lang w:val="en-AU"/>
+              </w:rPr>
               <w:t>considering</w:t>
             </w:r>
             <w:r>
+              <w:rPr>
+                <w:lang w:val="en-AU"/>
+              </w:rPr>
               <w:t xml:space="preserve"> weather factors and time lags.</w:t>
             </w:r>
           </w:p>
@@ -911,8 +1134,14 @@
     <w:p>
       <w:pPr>
         <w:pStyle w:val="Heading2"/>
-      </w:pPr>
-      <w:r>
+        <w:rPr>
+          <w:lang w:val="en-AU"/>
+        </w:rPr>
+      </w:pPr>
+      <w:r>
+        <w:rPr>
+          <w:lang w:val="en-AU"/>
+        </w:rPr>
         <w:t>Research questions and success criteria</w:t>
       </w:r>
     </w:p>
@@ -948,12 +1177,16 @@
             <w:pPr>
               <w:spacing w:after="0"/>
               <w:jc w:val="center"/>
+              <w:rPr>
+                <w:lang w:val="en-AU"/>
+              </w:rPr>
             </w:pPr>
             <w:r>
               <w:rPr>
                 <w:b/>
                 <w:color w:val="FFFFFF"/>
                 <w:sz w:val="15"/>
+                <w:lang w:val="en-AU"/>
               </w:rPr>
               <w:t>Research question</w:t>
             </w:r>
@@ -975,12 +1208,16 @@
             <w:pPr>
               <w:spacing w:after="0"/>
               <w:jc w:val="center"/>
+              <w:rPr>
+                <w:lang w:val="en-AU"/>
+              </w:rPr>
             </w:pPr>
             <w:r>
               <w:rPr>
                 <w:b/>
                 <w:color w:val="FFFFFF"/>
                 <w:sz w:val="15"/>
+                <w:lang w:val="en-AU"/>
               </w:rPr>
               <w:t>Planned output</w:t>
             </w:r>
@@ -1002,12 +1239,16 @@
             <w:pPr>
               <w:spacing w:after="0"/>
               <w:jc w:val="center"/>
+              <w:rPr>
+                <w:lang w:val="en-AU"/>
+              </w:rPr>
             </w:pPr>
             <w:r>
               <w:rPr>
                 <w:b/>
                 <w:color w:val="FFFFFF"/>
                 <w:sz w:val="15"/>
+                <w:lang w:val="en-AU"/>
               </w:rPr>
               <w:t>Success evidence</w:t>
             </w:r>
@@ -1033,11 +1274,15 @@
           <w:p>
             <w:pPr>
               <w:spacing w:after="0"/>
+              <w:rPr>
+                <w:lang w:val="en-AU"/>
+              </w:rPr>
             </w:pPr>
             <w:r>
               <w:rPr>
                 <w:color w:val="1F2937"/>
                 <w:sz w:val="15"/>
+                <w:lang w:val="en-AU"/>
               </w:rPr>
               <w:t xml:space="preserve">Q1. </w:t>
             </w:r>
@@ -1045,6 +1290,7 @@
               <w:rPr>
                 <w:color w:val="1F2937"/>
                 <w:sz w:val="15"/>
+                <w:lang w:val="en-AU"/>
               </w:rPr>
               <w:t>How strongly are half-hourly PV changes linked to demand changes?</w:t>
             </w:r>
@@ -1065,11 +1311,15 @@
           <w:p>
             <w:pPr>
               <w:spacing w:after="0"/>
+              <w:rPr>
+                <w:lang w:val="en-AU"/>
+              </w:rPr>
             </w:pPr>
             <w:r>
               <w:rPr>
                 <w:color w:val="1F2937"/>
                 <w:sz w:val="15"/>
+                <w:lang w:val="en-AU"/>
               </w:rPr>
               <w:t>Correlation, regression and effect size in MW.</w:t>
             </w:r>
@@ -1090,11 +1340,15 @@
           <w:p>
             <w:pPr>
               <w:spacing w:after="0"/>
+              <w:rPr>
+                <w:lang w:val="en-AU"/>
+              </w:rPr>
             </w:pPr>
             <w:r>
               <w:rPr>
                 <w:color w:val="1F2937"/>
                 <w:sz w:val="15"/>
+                <w:lang w:val="en-AU"/>
               </w:rPr>
               <w:t>Coefficient uncertainty and diagnostics.</w:t>
             </w:r>
@@ -1120,11 +1374,15 @@
           <w:p>
             <w:pPr>
               <w:spacing w:after="0"/>
+              <w:rPr>
+                <w:lang w:val="en-AU"/>
+              </w:rPr>
             </w:pPr>
             <w:r>
               <w:rPr>
                 <w:color w:val="1F2937"/>
                 <w:sz w:val="15"/>
+                <w:lang w:val="en-AU"/>
               </w:rPr>
               <w:t xml:space="preserve">Q2. </w:t>
             </w:r>
@@ -1132,6 +1390,7 @@
               <w:rPr>
                 <w:color w:val="1F2937"/>
                 <w:sz w:val="15"/>
+                <w:lang w:val="en-AU"/>
               </w:rPr>
               <w:t>How does this effect change based on time and weather?</w:t>
             </w:r>
@@ -1152,11 +1411,15 @@
           <w:p>
             <w:pPr>
               <w:spacing w:after="0"/>
+              <w:rPr>
+                <w:lang w:val="en-AU"/>
+              </w:rPr>
             </w:pPr>
             <w:r>
               <w:rPr>
                 <w:color w:val="1F2937"/>
                 <w:sz w:val="15"/>
+                <w:lang w:val="en-AU"/>
               </w:rPr>
               <w:t>Results broken down by hour, season, and weather.</w:t>
             </w:r>
@@ -1177,11 +1440,15 @@
           <w:p>
             <w:pPr>
               <w:spacing w:after="0"/>
+              <w:rPr>
+                <w:lang w:val="en-AU"/>
+              </w:rPr>
             </w:pPr>
             <w:r>
               <w:rPr>
                 <w:color w:val="1F2937"/>
                 <w:sz w:val="15"/>
+                <w:lang w:val="en-AU"/>
               </w:rPr>
               <w:t>Stable patterns across validation periods.</w:t>
             </w:r>
@@ -1207,11 +1474,15 @@
           <w:p>
             <w:pPr>
               <w:spacing w:after="0"/>
+              <w:rPr>
+                <w:lang w:val="en-AU"/>
+              </w:rPr>
             </w:pPr>
             <w:r>
               <w:rPr>
                 <w:color w:val="1F2937"/>
                 <w:sz w:val="15"/>
+                <w:lang w:val="en-AU"/>
               </w:rPr>
               <w:t xml:space="preserve">Q3. </w:t>
             </w:r>
@@ -1219,6 +1490,7 @@
               <w:rPr>
                 <w:color w:val="1F2937"/>
                 <w:sz w:val="15"/>
+                <w:lang w:val="en-AU"/>
               </w:rPr>
               <w:t xml:space="preserve">Does PV </w:t>
             </w:r>
@@ -1226,6 +1498,7 @@
               <w:rPr>
                 <w:color w:val="1F2937"/>
                 <w:sz w:val="15"/>
+                <w:lang w:val="en-AU"/>
               </w:rPr>
               <w:t>improve</w:t>
             </w:r>
@@ -1233,6 +1506,7 @@
               <w:rPr>
                 <w:color w:val="1F2937"/>
                 <w:sz w:val="15"/>
+                <w:lang w:val="en-AU"/>
               </w:rPr>
               <w:t xml:space="preserve"> short-term demand prediction?</w:t>
             </w:r>
@@ -1253,11 +1527,15 @@
           <w:p>
             <w:pPr>
               <w:spacing w:after="0"/>
+              <w:rPr>
+                <w:lang w:val="en-AU"/>
+              </w:rPr>
             </w:pPr>
             <w:r>
               <w:rPr>
                 <w:color w:val="1F2937"/>
                 <w:sz w:val="15"/>
+                <w:lang w:val="en-AU"/>
               </w:rPr>
               <w:t>A comparison of baseline vs. PV-enhanced models.</w:t>
             </w:r>
@@ -1278,11 +1556,15 @@
           <w:p>
             <w:pPr>
               <w:spacing w:after="0"/>
+              <w:rPr>
+                <w:lang w:val="en-AU"/>
+              </w:rPr>
             </w:pPr>
             <w:r>
               <w:rPr>
                 <w:color w:val="1F2937"/>
                 <w:sz w:val="15"/>
+                <w:lang w:val="en-AU"/>
               </w:rPr>
               <w:t>Out-of-sample MAE and RMSE.</w:t>
             </w:r>
@@ -1293,40 +1575,300 @@
     <w:p>
       <w:pPr>
         <w:pStyle w:val="Heading1"/>
-      </w:pPr>
-      <w:r>
+        <w:rPr>
+          <w:lang w:val="en-AU"/>
+        </w:rPr>
+      </w:pPr>
+      <w:r>
+        <w:rPr>
+          <w:lang w:val="en-AU"/>
+        </w:rPr>
         <w:t>2. Brief Preliminary Literature Review</w:t>
       </w:r>
     </w:p>
     <w:p>
-      <w:r>
+      <w:pPr>
+        <w:rPr>
+          <w:lang w:val="en-AU"/>
+        </w:rPr>
+      </w:pPr>
+      <w:r>
+        <w:rPr>
+          <w:lang w:val="en-AU"/>
+        </w:rPr>
         <w:t xml:space="preserve">Yan and Han (2023) </w:t>
       </w:r>
       <w:r>
+        <w:rPr>
+          <w:lang w:val="en-AU"/>
+        </w:rPr>
         <w:t>investigated</w:t>
       </w:r>
       <w:r>
+        <w:rPr>
+          <w:lang w:val="en-AU"/>
+        </w:rPr>
         <w:t xml:space="preserve"> how rooftop solar impacts wholesale electricity demand within Australia's NEM. By applying state-level regression models to half-hourly data, they discovered that rooftop PV lowers daytime grid demand, which helps create a duck-curve demand profile. This study is particularly useful since it provides a way to quantify the relationship between rooftop PV and demand patterns.</w:t>
-      </w:r>
-    </w:p>
-    <w:p/>
-    <w:p>
-      <w:r>
-        <w:t>Houchati, Beitelmal, and Khraisheh (2022) employed support vector regression, combining PV, energy consumption, and weather data to forecast rooftop solar output and assist with demand scheduling. They measured performance through prediction accuracy, noting that they achieved over 90% accuracy on sunny days. This really underscores how important weather variables are when you're trying to model solar variability.</w:t>
-      </w:r>
-      <w:r>
-        <w:br w:type="page"/>
       </w:r>
     </w:p>
     <w:p>
       <w:pPr>
+        <w:rPr>
+          <w:lang w:val="en-AU"/>
+        </w:rPr>
+      </w:pPr>
+    </w:p>
+    <w:p>
+      <w:pPr>
+        <w:rPr>
+          <w:lang w:val="en-AU"/>
+        </w:rPr>
+      </w:pPr>
+      <w:proofErr w:type="spellStart"/>
+      <w:r>
+        <w:rPr>
+          <w:lang w:val="en-AU"/>
+        </w:rPr>
+        <w:t>Houchati</w:t>
+      </w:r>
+      <w:proofErr w:type="spellEnd"/>
+      <w:r>
+        <w:rPr>
+          <w:lang w:val="en-AU"/>
+        </w:rPr>
+        <w:t xml:space="preserve">, </w:t>
+      </w:r>
+      <w:proofErr w:type="spellStart"/>
+      <w:r>
+        <w:rPr>
+          <w:lang w:val="en-AU"/>
+        </w:rPr>
+        <w:t>Beitelmal</w:t>
+      </w:r>
+      <w:proofErr w:type="spellEnd"/>
+      <w:r>
+        <w:rPr>
+          <w:lang w:val="en-AU"/>
+        </w:rPr>
+        <w:t xml:space="preserve">, and </w:t>
+      </w:r>
+      <w:proofErr w:type="spellStart"/>
+      <w:r>
+        <w:rPr>
+          <w:lang w:val="en-AU"/>
+        </w:rPr>
+        <w:t>Khraisheh</w:t>
+      </w:r>
+      <w:proofErr w:type="spellEnd"/>
+      <w:r>
+        <w:rPr>
+          <w:lang w:val="en-AU"/>
+        </w:rPr>
+        <w:t xml:space="preserve"> (2022) employed support vector regression, combining PV, energy consumption, and weather data to forecast rooftop solar output and assist with demand scheduling. They measured performance through prediction accuracy, noting that they achieved over 90% accuracy on sunny days. This really underscores how important weather variables are when you're trying to model solar variability.</w:t>
+      </w:r>
+    </w:p>
+    <w:p>
+      <w:pPr>
+        <w:rPr>
+          <w:lang w:val="en-AU"/>
+        </w:rPr>
+      </w:pPr>
+    </w:p>
+    <w:p>
+      <w:pPr>
+        <w:rPr>
+          <w:lang w:val="en-AU"/>
+        </w:rPr>
+      </w:pPr>
+      <w:r>
+        <w:rPr>
+          <w:lang w:val="en-AU"/>
+        </w:rPr>
+        <w:t xml:space="preserve">Bae, Kwon, and Song (2021) explored how behind-the-metre </w:t>
+      </w:r>
+      <w:r>
+        <w:rPr>
+          <w:lang w:val="en-AU"/>
+        </w:rPr>
+        <w:t xml:space="preserve">generation from rooftop PV solar panels distorts grid </w:t>
+      </w:r>
+      <w:proofErr w:type="gramStart"/>
+      <w:r>
+        <w:rPr>
+          <w:lang w:val="en-AU"/>
+        </w:rPr>
+        <w:t>demand, and</w:t>
+      </w:r>
+      <w:proofErr w:type="gramEnd"/>
+      <w:r>
+        <w:rPr>
+          <w:lang w:val="en-AU"/>
+        </w:rPr>
+        <w:t xml:space="preserve"> proposed an Extreme Gradient Boosting (</w:t>
+      </w:r>
+      <w:proofErr w:type="spellStart"/>
+      <w:r>
+        <w:rPr>
+          <w:lang w:val="en-AU"/>
+        </w:rPr>
+        <w:t>XGBoost</w:t>
+      </w:r>
+      <w:proofErr w:type="spellEnd"/>
+      <w:r>
+        <w:rPr>
+          <w:lang w:val="en-AU"/>
+        </w:rPr>
+        <w:t>) forecasting model to help address this. By estimating the actual PV generation</w:t>
+      </w:r>
+      <w:r>
+        <w:rPr>
+          <w:lang w:val="en-AU"/>
+        </w:rPr>
+        <w:t xml:space="preserve"> and reconstructing true electric load, they significantly reduced prediction errors when compared with </w:t>
+      </w:r>
+      <w:r>
+        <w:rPr>
+          <w:lang w:val="en-AU"/>
+        </w:rPr>
+        <w:t>previous baseline models. This research is highly relevant to the proposed project, as it directly demonstrates a method of how to handle unmetered rooftop PV data</w:t>
+      </w:r>
+      <w:r>
+        <w:rPr>
+          <w:lang w:val="en-AU"/>
+        </w:rPr>
+        <w:t xml:space="preserve"> and validates the use of </w:t>
+      </w:r>
+      <w:proofErr w:type="spellStart"/>
+      <w:r>
+        <w:rPr>
+          <w:lang w:val="en-AU"/>
+        </w:rPr>
+        <w:t>XGBoost</w:t>
+      </w:r>
+      <w:proofErr w:type="spellEnd"/>
+      <w:r>
+        <w:rPr>
+          <w:lang w:val="en-AU"/>
+        </w:rPr>
+        <w:t xml:space="preserve"> for short-term demand prediction.</w:t>
+      </w:r>
+    </w:p>
+    <w:p>
+      <w:pPr>
+        <w:rPr>
+          <w:lang w:val="en-AU"/>
+        </w:rPr>
+      </w:pPr>
+    </w:p>
+    <w:p>
+      <w:pPr>
+        <w:rPr>
+          <w:lang w:val="en-AU"/>
+        </w:rPr>
+      </w:pPr>
+      <w:r>
+        <w:rPr>
+          <w:lang w:val="en-AU"/>
+        </w:rPr>
+        <w:t>Yildiz et al. (2018) evaluated</w:t>
+      </w:r>
+      <w:r>
+        <w:rPr>
+          <w:lang w:val="en-AU"/>
+        </w:rPr>
+        <w:t xml:space="preserve"> </w:t>
+      </w:r>
+      <w:r>
+        <w:rPr>
+          <w:lang w:val="en-AU"/>
+        </w:rPr>
+        <w:t xml:space="preserve">short-term forecasting models for behind-the-metre rooftop PV </w:t>
+      </w:r>
+      <w:proofErr w:type="spellStart"/>
+      <w:r>
+        <w:rPr>
+          <w:lang w:val="en-AU"/>
+        </w:rPr>
+        <w:t>olar</w:t>
+      </w:r>
+      <w:proofErr w:type="spellEnd"/>
+      <w:r>
+        <w:rPr>
+          <w:lang w:val="en-AU"/>
+        </w:rPr>
+        <w:t xml:space="preserve"> generation </w:t>
+      </w:r>
+      <w:r>
+        <w:rPr>
+          <w:lang w:val="en-AU"/>
+        </w:rPr>
+        <w:t>and residential electricity demand in New South Wales across multiple temporal resolutions. By integrating</w:t>
+      </w:r>
+      <w:r>
+        <w:rPr>
+          <w:lang w:val="en-AU"/>
+        </w:rPr>
+        <w:t xml:space="preserve"> local meteorological data with</w:t>
+      </w:r>
+      <w:r>
+        <w:rPr>
+          <w:lang w:val="en-AU"/>
+        </w:rPr>
+        <w:t xml:space="preserve"> granular smart-metre </w:t>
+      </w:r>
+      <w:r>
+        <w:rPr>
+          <w:lang w:val="en-AU"/>
+        </w:rPr>
+        <w:t xml:space="preserve">observations, they were able to show that weather-augmented models substantially reduced forecasting error during periods of rapid solar output swings. This is directly relevant for the proposed </w:t>
+      </w:r>
+      <w:proofErr w:type="gramStart"/>
+      <w:r>
+        <w:rPr>
+          <w:lang w:val="en-AU"/>
+        </w:rPr>
+        <w:t>project, and</w:t>
+      </w:r>
+      <w:proofErr w:type="gramEnd"/>
+      <w:r>
+        <w:rPr>
+          <w:lang w:val="en-AU"/>
+        </w:rPr>
+        <w:t xml:space="preserve"> validates our proposed </w:t>
+      </w:r>
+      <w:r>
+        <w:rPr>
+          <w:lang w:val="en-AU"/>
+        </w:rPr>
+        <w:t>method.</w:t>
+      </w:r>
+    </w:p>
+    <w:p>
+      <w:pPr>
+        <w:rPr>
+          <w:lang w:val="en-AU"/>
+        </w:rPr>
+      </w:pPr>
+      <w:r>
+        <w:rPr>
+          <w:lang w:val="en-AU"/>
+        </w:rPr>
+        <w:br w:type="page"/>
+      </w:r>
+    </w:p>
+    <w:p>
+      <w:pPr>
         <w:spacing w:after="40"/>
+        <w:rPr>
+          <w:lang w:val="en-AU"/>
+        </w:rPr>
       </w:pPr>
       <w:r>
         <w:rPr>
           <w:b/>
           <w:color w:val="00A6A6"/>
           <w:sz w:val="16"/>
+          <w:lang w:val="en-AU"/>
         </w:rPr>
         <w:lastRenderedPageBreak/>
         <w:t>PAGE 2 OF 3</w:t>
@@ -1335,71 +1877,215 @@
     <w:p>
       <w:pPr>
         <w:pStyle w:val="Heading1"/>
-      </w:pPr>
-      <w:r>
+        <w:rPr>
+          <w:lang w:val="en-AU"/>
+        </w:rPr>
+      </w:pPr>
+      <w:r>
+        <w:rPr>
+          <w:lang w:val="en-AU"/>
+        </w:rPr>
         <w:t>3. Methods, Software and Data Description</w:t>
       </w:r>
     </w:p>
     <w:p>
       <w:pPr>
         <w:pStyle w:val="Heading2"/>
-      </w:pPr>
-      <w:r>
+        <w:rPr>
+          <w:lang w:val="en-AU"/>
+        </w:rPr>
+      </w:pPr>
+      <w:r>
+        <w:rPr>
+          <w:lang w:val="en-AU"/>
+        </w:rPr>
         <w:t>Methods and software</w:t>
       </w:r>
     </w:p>
     <w:p>
-      <w:r>
+      <w:pPr>
+        <w:rPr>
+          <w:lang w:val="en-AU"/>
+        </w:rPr>
+      </w:pPr>
+      <w:r>
+        <w:rPr>
+          <w:lang w:val="en-AU"/>
+        </w:rPr>
         <w:t xml:space="preserve">First, we will use </w:t>
       </w:r>
       <w:r>
+        <w:rPr>
+          <w:lang w:val="en-AU"/>
+        </w:rPr>
         <w:t>exploration</w:t>
       </w:r>
       <w:r>
+        <w:rPr>
+          <w:lang w:val="en-AU"/>
+        </w:rPr>
         <w:t xml:space="preserve"> analysis and visuali</w:t>
       </w:r>
       <w:r>
+        <w:rPr>
+          <w:lang w:val="en-AU"/>
+        </w:rPr>
         <w:t>s</w:t>
       </w:r>
       <w:r>
+        <w:rPr>
+          <w:lang w:val="en-AU"/>
+        </w:rPr>
         <w:t>ation to compare how solar generation and demand patterns change based on the time of day and weather conditions. We will also run correlation and cross-correlation analyses to spot specific relationships and any potential lag effects. To estimate the impact of rooftop PV, we will use OLS or generali</w:t>
       </w:r>
       <w:r>
+        <w:rPr>
+          <w:lang w:val="en-AU"/>
+        </w:rPr>
         <w:t>s</w:t>
       </w:r>
       <w:r>
+        <w:rPr>
+          <w:lang w:val="en-AU"/>
+        </w:rPr>
         <w:t xml:space="preserve">ed additive regression, making sure to control for variables like the hour, weekday, season, and weather. We also plan to set up a machine-learning benchmark, using something like gradient-boosted trees, to see if non-linear interactions help improve our predictions. To keep things honest and prevent future information from leaking into earlier periods, we will use chronological splits for training, validation, and testing. </w:t>
-      </w:r>
-    </w:p>
-    <w:p/>
-    <w:p>
-      <w:r>
-        <w:t>Python will be our primary language for this project. For data prep</w:t>
-      </w:r>
-      <w:r>
-        <w:t>aration</w:t>
-      </w:r>
-      <w:r>
-        <w:t>, we will likely use pandas or polars along with NumPy. We will use Matplotlib</w:t>
-      </w:r>
-      <w:r>
-        <w:t xml:space="preserve"> or Seaborn </w:t>
-      </w:r>
-      <w:r>
-        <w:t xml:space="preserve">for our charts, and statsmodels or pyGAM for </w:t>
-      </w:r>
-      <w:r>
-        <w:t>statistical</w:t>
-      </w:r>
-      <w:r>
-        <w:t xml:space="preserve"> modeling. For the machine-learning benchmarks, we will rely on scikit-learn combined with XGBoost or LightGBM. We will also use Git to manage version control and help the team collaborate.</w:t>
       </w:r>
     </w:p>
     <w:p>
       <w:pPr>
+        <w:rPr>
+          <w:lang w:val="en-AU"/>
+        </w:rPr>
+      </w:pPr>
+    </w:p>
+    <w:p>
+      <w:pPr>
+        <w:rPr>
+          <w:lang w:val="en-AU"/>
+        </w:rPr>
+      </w:pPr>
+      <w:r>
+        <w:rPr>
+          <w:lang w:val="en-AU"/>
+        </w:rPr>
+        <w:t>Python will be our primary language for this project. For data prep</w:t>
+      </w:r>
+      <w:r>
+        <w:rPr>
+          <w:lang w:val="en-AU"/>
+        </w:rPr>
+        <w:t>aration</w:t>
+      </w:r>
+      <w:r>
+        <w:rPr>
+          <w:lang w:val="en-AU"/>
+        </w:rPr>
+        <w:t>, we will likely use pandas or polars along with NumPy. We will use Matplotlib</w:t>
+      </w:r>
+      <w:r>
+        <w:rPr>
+          <w:lang w:val="en-AU"/>
+        </w:rPr>
+        <w:t xml:space="preserve"> or Seaborn </w:t>
+      </w:r>
+      <w:r>
+        <w:rPr>
+          <w:lang w:val="en-AU"/>
+        </w:rPr>
+        <w:t xml:space="preserve">for our charts, and </w:t>
+      </w:r>
+      <w:proofErr w:type="spellStart"/>
+      <w:r>
+        <w:rPr>
+          <w:lang w:val="en-AU"/>
+        </w:rPr>
+        <w:t>statsmodels</w:t>
+      </w:r>
+      <w:proofErr w:type="spellEnd"/>
+      <w:r>
+        <w:rPr>
+          <w:lang w:val="en-AU"/>
+        </w:rPr>
+        <w:t xml:space="preserve"> or </w:t>
+      </w:r>
+      <w:proofErr w:type="spellStart"/>
+      <w:r>
+        <w:rPr>
+          <w:lang w:val="en-AU"/>
+        </w:rPr>
+        <w:t>pyGAM</w:t>
+      </w:r>
+      <w:proofErr w:type="spellEnd"/>
+      <w:r>
+        <w:rPr>
+          <w:lang w:val="en-AU"/>
+        </w:rPr>
+        <w:t xml:space="preserve"> for </w:t>
+      </w:r>
+      <w:r>
+        <w:rPr>
+          <w:lang w:val="en-AU"/>
+        </w:rPr>
+        <w:t>statistical</w:t>
+      </w:r>
+      <w:r>
+        <w:rPr>
+          <w:lang w:val="en-AU"/>
+        </w:rPr>
+        <w:t xml:space="preserve"> mode</w:t>
+      </w:r>
+      <w:r>
+        <w:rPr>
+          <w:lang w:val="en-AU"/>
+        </w:rPr>
+        <w:t>l</w:t>
+      </w:r>
+      <w:r>
+        <w:rPr>
+          <w:lang w:val="en-AU"/>
+        </w:rPr>
+        <w:t xml:space="preserve">ling. For the machine-learning benchmarks, we will rely on scikit-learn combined with </w:t>
+      </w:r>
+      <w:proofErr w:type="spellStart"/>
+      <w:r>
+        <w:rPr>
+          <w:lang w:val="en-AU"/>
+        </w:rPr>
+        <w:t>XGBoost</w:t>
+      </w:r>
+      <w:proofErr w:type="spellEnd"/>
+      <w:r>
+        <w:rPr>
+          <w:lang w:val="en-AU"/>
+        </w:rPr>
+        <w:t xml:space="preserve"> or </w:t>
+      </w:r>
+      <w:proofErr w:type="spellStart"/>
+      <w:r>
+        <w:rPr>
+          <w:lang w:val="en-AU"/>
+        </w:rPr>
+        <w:t>LightGBM</w:t>
+      </w:r>
+      <w:proofErr w:type="spellEnd"/>
+      <w:r>
+        <w:rPr>
+          <w:lang w:val="en-AU"/>
+        </w:rPr>
+        <w:t>. We will also use Git to manage version control and help the team collaborate.</w:t>
+      </w:r>
+    </w:p>
+    <w:p>
+      <w:pPr>
         <w:pStyle w:val="Heading2"/>
-      </w:pPr>
-      <w:r>
+        <w:rPr>
+          <w:lang w:val="en-AU"/>
+        </w:rPr>
+      </w:pPr>
+      <w:r>
+        <w:rPr>
+          <w:lang w:val="en-AU"/>
+        </w:rPr>
         <w:t>Data description</w:t>
       </w:r>
     </w:p>
@@ -1435,12 +2121,16 @@
             <w:pPr>
               <w:spacing w:after="0"/>
               <w:jc w:val="center"/>
+              <w:rPr>
+                <w:lang w:val="en-AU"/>
+              </w:rPr>
             </w:pPr>
             <w:r>
               <w:rPr>
                 <w:b/>
                 <w:color w:val="FFFFFF"/>
                 <w:sz w:val="15"/>
+                <w:lang w:val="en-AU"/>
               </w:rPr>
               <w:t>Dataset</w:t>
             </w:r>
@@ -1462,12 +2152,16 @@
             <w:pPr>
               <w:spacing w:after="0"/>
               <w:jc w:val="center"/>
+              <w:rPr>
+                <w:lang w:val="en-AU"/>
+              </w:rPr>
             </w:pPr>
             <w:r>
               <w:rPr>
                 <w:b/>
                 <w:color w:val="FFFFFF"/>
                 <w:sz w:val="15"/>
+                <w:lang w:val="en-AU"/>
               </w:rPr>
               <w:t>Variables and format</w:t>
             </w:r>
@@ -1489,12 +2183,16 @@
             <w:pPr>
               <w:spacing w:after="0"/>
               <w:jc w:val="center"/>
+              <w:rPr>
+                <w:lang w:val="en-AU"/>
+              </w:rPr>
             </w:pPr>
             <w:r>
               <w:rPr>
                 <w:b/>
                 <w:color w:val="FFFFFF"/>
                 <w:sz w:val="15"/>
+                <w:lang w:val="en-AU"/>
               </w:rPr>
               <w:t>Relevance and issues</w:t>
             </w:r>
@@ -1520,11 +2218,15 @@
           <w:p>
             <w:pPr>
               <w:spacing w:after="0"/>
+              <w:rPr>
+                <w:lang w:val="en-AU"/>
+              </w:rPr>
             </w:pPr>
             <w:r>
               <w:rPr>
                 <w:color w:val="1F2937"/>
                 <w:sz w:val="15"/>
+                <w:lang w:val="en-AU"/>
               </w:rPr>
               <w:t>AEMO rooftop PV actual</w:t>
             </w:r>
@@ -1545,11 +2247,15 @@
           <w:p>
             <w:pPr>
               <w:spacing w:after="0"/>
+              <w:rPr>
+                <w:lang w:val="en-AU"/>
+              </w:rPr>
             </w:pPr>
             <w:r>
               <w:rPr>
                 <w:color w:val="1F2937"/>
                 <w:sz w:val="15"/>
+                <w:lang w:val="en-AU"/>
               </w:rPr>
               <w:t>CSV or table containing timestamps, regions, PV generation in MW, and quality indicators.</w:t>
             </w:r>
@@ -1570,11 +2276,15 @@
           <w:p>
             <w:pPr>
               <w:spacing w:after="0"/>
+              <w:rPr>
+                <w:lang w:val="en-AU"/>
+              </w:rPr>
             </w:pPr>
             <w:r>
               <w:rPr>
                 <w:color w:val="1F2937"/>
                 <w:sz w:val="15"/>
+                <w:lang w:val="en-AU"/>
               </w:rPr>
               <w:t>This is our main explanatory variable. We will need to keep an eye out for estimate revisions, duplicates, and data gaps.</w:t>
             </w:r>
@@ -1600,11 +2310,15 @@
           <w:p>
             <w:pPr>
               <w:spacing w:after="0"/>
+              <w:rPr>
+                <w:lang w:val="en-AU"/>
+              </w:rPr>
             </w:pPr>
             <w:r>
               <w:rPr>
                 <w:color w:val="1F2937"/>
                 <w:sz w:val="15"/>
+                <w:lang w:val="en-AU"/>
               </w:rPr>
               <w:t>AEMO operational demand</w:t>
             </w:r>
@@ -1625,11 +2339,15 @@
           <w:p>
             <w:pPr>
               <w:spacing w:after="0"/>
+              <w:rPr>
+                <w:lang w:val="en-AU"/>
+              </w:rPr>
             </w:pPr>
             <w:r>
               <w:rPr>
                 <w:color w:val="1F2937"/>
                 <w:sz w:val="15"/>
+                <w:lang w:val="en-AU"/>
               </w:rPr>
               <w:t>CSV or table containing timestamps, regions, and demand in MW.</w:t>
             </w:r>
@@ -1650,11 +2368,15 @@
           <w:p>
             <w:pPr>
               <w:spacing w:after="0"/>
+              <w:rPr>
+                <w:lang w:val="en-AU"/>
+              </w:rPr>
             </w:pPr>
             <w:r>
               <w:rPr>
                 <w:color w:val="1F2937"/>
                 <w:sz w:val="15"/>
+                <w:lang w:val="en-AU"/>
               </w:rPr>
               <w:t>This is our outcome variable. We need to check for missing intervals and any anomalies.</w:t>
             </w:r>
@@ -1680,11 +2402,15 @@
           <w:p>
             <w:pPr>
               <w:spacing w:after="0"/>
+              <w:rPr>
+                <w:lang w:val="en-AU"/>
+              </w:rPr>
             </w:pPr>
             <w:r>
               <w:rPr>
                 <w:color w:val="1F2937"/>
                 <w:sz w:val="15"/>
+                <w:lang w:val="en-AU"/>
               </w:rPr>
               <w:t>Weather data</w:t>
             </w:r>
@@ -1705,11 +2431,15 @@
           <w:p>
             <w:pPr>
               <w:spacing w:after="0"/>
+              <w:rPr>
+                <w:lang w:val="en-AU"/>
+              </w:rPr>
             </w:pPr>
             <w:r>
               <w:rPr>
                 <w:color w:val="1F2937"/>
                 <w:sz w:val="15"/>
+                <w:lang w:val="en-AU"/>
               </w:rPr>
               <w:t>CSV or API extracts for temperature, cloud cover, or irradiance.</w:t>
             </w:r>
@@ -1730,11 +2460,15 @@
           <w:p>
             <w:pPr>
               <w:spacing w:after="0"/>
+              <w:rPr>
+                <w:lang w:val="en-AU"/>
+              </w:rPr>
             </w:pPr>
             <w:r>
               <w:rPr>
                 <w:color w:val="1F2937"/>
                 <w:sz w:val="15"/>
+                <w:lang w:val="en-AU"/>
               </w:rPr>
               <w:t>This explains solar variability, but it will require careful spatial and temporal alignment.</w:t>
             </w:r>
@@ -1760,11 +2494,15 @@
           <w:p>
             <w:pPr>
               <w:spacing w:after="0"/>
+              <w:rPr>
+                <w:lang w:val="en-AU"/>
+              </w:rPr>
             </w:pPr>
             <w:r>
               <w:rPr>
                 <w:color w:val="1F2937"/>
                 <w:sz w:val="15"/>
+                <w:lang w:val="en-AU"/>
               </w:rPr>
               <w:t>Calendar data</w:t>
             </w:r>
@@ -1785,11 +2523,15 @@
           <w:p>
             <w:pPr>
               <w:spacing w:after="0"/>
+              <w:rPr>
+                <w:lang w:val="en-AU"/>
+              </w:rPr>
             </w:pPr>
             <w:r>
               <w:rPr>
                 <w:color w:val="1F2937"/>
                 <w:sz w:val="15"/>
+                <w:lang w:val="en-AU"/>
               </w:rPr>
               <w:t>Derived fields like hour, weekday, month, season, and holidays.</w:t>
             </w:r>
@@ -1810,107 +2552,139 @@
           <w:p>
             <w:pPr>
               <w:spacing w:after="0"/>
+              <w:rPr>
+                <w:lang w:val="en-AU"/>
+              </w:rPr>
             </w:pPr>
             <w:r>
               <w:rPr>
                 <w:color w:val="1F2937"/>
                 <w:sz w:val="15"/>
-              </w:rPr>
-              <w:t xml:space="preserve">These help </w:t>
-            </w:r>
-            <w:r>
-              <w:rPr>
-                <w:color w:val="1F2937"/>
-                <w:sz w:val="15"/>
-              </w:rPr>
-              <w:t>control</w:t>
-            </w:r>
-            <w:r>
-              <w:rPr>
-                <w:color w:val="1F2937"/>
-                <w:sz w:val="15"/>
-              </w:rPr>
-              <w:t xml:space="preserve"> recurring demand patterns. We also need to double-check </w:t>
-            </w:r>
-            <w:r>
-              <w:rPr>
-                <w:color w:val="1F2937"/>
-                <w:sz w:val="15"/>
-              </w:rPr>
-              <w:t>time zones</w:t>
-            </w:r>
-            <w:r>
-              <w:rPr>
-                <w:color w:val="1F2937"/>
-                <w:sz w:val="15"/>
-              </w:rPr>
-              <w:t xml:space="preserve"> and </w:t>
-            </w:r>
-            <w:r>
-              <w:rPr>
-                <w:color w:val="1F2937"/>
-                <w:sz w:val="15"/>
-              </w:rPr>
-              <w:t>daylight-saving</w:t>
-            </w:r>
-            <w:r>
-              <w:rPr>
-                <w:color w:val="1F2937"/>
-                <w:sz w:val="15"/>
-              </w:rPr>
-              <w:t xml:space="preserve"> changes.</w:t>
+                <w:lang w:val="en-AU"/>
+              </w:rPr>
+              <w:t>These help control recurring demand patterns. We also need to double-check time zones and daylight-saving changes.</w:t>
             </w:r>
           </w:p>
         </w:tc>
       </w:tr>
     </w:tbl>
     <w:p>
-      <w:r>
-        <w:t xml:space="preserve">The final combined </w:t>
-      </w:r>
-      <w:r>
-        <w:t>data set</w:t>
-      </w:r>
-      <w:r>
-        <w:t xml:space="preserve"> will consist of half-hourly observations across the chosen NEM regions. Depending on our scope, several years of data could result in hundreds of thousands of rows. The main challenge will be merging different sources that have different timestamps, locations, and revision cycles.</w:t>
+      <w:pPr>
+        <w:rPr>
+          <w:lang w:val="en-AU"/>
+        </w:rPr>
+      </w:pPr>
+      <w:r>
+        <w:rPr>
+          <w:lang w:val="en-AU"/>
+        </w:rPr>
+        <w:t xml:space="preserve">Additional data will be sourced to augment the </w:t>
+      </w:r>
+      <w:r>
+        <w:rPr>
+          <w:lang w:val="en-AU"/>
+        </w:rPr>
+        <w:t xml:space="preserve">provided generation and demand data. The Australian Bureau of Meteorology (BoM) maintains a range of expansive datasets </w:t>
+      </w:r>
+      <w:r>
+        <w:rPr>
+          <w:lang w:val="en-AU"/>
+        </w:rPr>
+        <w:t>including half-hourly surface observations directly from weather stations across New South Wales. This data, combined with generation and demand data from AEMO</w:t>
+      </w:r>
+      <w:r>
+        <w:rPr>
+          <w:lang w:val="en-AU"/>
+        </w:rPr>
+        <w:t xml:space="preserve">, will provide a </w:t>
+      </w:r>
+      <w:r>
+        <w:rPr>
+          <w:lang w:val="en-AU"/>
+        </w:rPr>
+        <w:t xml:space="preserve">complete picture </w:t>
+      </w:r>
+      <w:r>
+        <w:rPr>
+          <w:lang w:val="en-AU"/>
+        </w:rPr>
+        <w:t>for better predicting the effect solar generation has on demand.</w:t>
       </w:r>
     </w:p>
     <w:p>
       <w:pPr>
-        <w:pStyle w:val="Heading2"/>
-      </w:pPr>
-      <w:r>
-        <w:t>Processing and evaluation</w:t>
-      </w:r>
+        <w:rPr>
+          <w:lang w:val="en-AU"/>
+        </w:rPr>
+      </w:pPr>
     </w:p>
     <w:p>
       <w:pPr>
-        <w:spacing w:after="40"/>
-      </w:pPr>
-      <w:r>
-        <w:t>To get started, we will standardi</w:t>
-      </w:r>
-      <w:r>
-        <w:t>s</w:t>
-      </w:r>
-      <w:r>
-        <w:t>e all timestamps and region codes, then fix any issues with daylight-saving duplicates or missing intervals. After that, we will join the PV, demand, weather, and calendar data while keeping a log of data quality. We will also create new features like changes and ramps, such as delta PV and delta Demand, along with 30 to 120-minute lag features. Finally, we will evaluate our statistical models using effect sizes, confidence intervals, and residual checks, while using MAE and RMSE to measure our prediction accuracy.</w:t>
+        <w:rPr>
+          <w:lang w:val="en-AU"/>
+        </w:rPr>
+      </w:pPr>
+      <w:r>
+        <w:rPr>
+          <w:lang w:val="en-AU"/>
+        </w:rPr>
+        <w:t>The final combined data set will consist of half-hourly observations across the chosen NEM regions. Depending on our scope, several years of data could result in hundreds of thousands of rows. The main challenge will be merging different sources that have different timestamps, locations, and revision cycles.</w:t>
       </w:r>
     </w:p>
     <w:p>
-      <w:r>
-        <w:br w:type="page"/>
+      <w:pPr>
+        <w:pStyle w:val="Heading2"/>
+        <w:rPr>
+          <w:lang w:val="en-AU"/>
+        </w:rPr>
+      </w:pPr>
+      <w:r>
+        <w:rPr>
+          <w:lang w:val="en-AU"/>
+        </w:rPr>
+        <w:t>Processing and evaluation</w:t>
       </w:r>
     </w:p>
     <w:p>
       <w:pPr>
         <w:spacing w:after="40"/>
+        <w:rPr>
+          <w:lang w:val="en-AU"/>
+        </w:rPr>
+      </w:pPr>
+      <w:r>
+        <w:rPr>
+          <w:lang w:val="en-AU"/>
+        </w:rPr>
+        <w:t>To get started, we will standardise all timestamps and region codes, then fix any issues with daylight-saving duplicates or missing intervals. After that, we will join the PV, demand, weather, and calendar data while keeping a log of data quality. We will also create new features like changes and ramps, such as delta PV and delta Demand, along with 30 to 120-minute lag features. Finally, we will evaluate our statistical models using effect sizes, confidence intervals, and residual checks, while using MAE and RMSE to measure our prediction accuracy.</w:t>
+      </w:r>
+    </w:p>
+    <w:p>
+      <w:pPr>
+        <w:rPr>
+          <w:lang w:val="en-AU"/>
+        </w:rPr>
+      </w:pPr>
+      <w:r>
+        <w:rPr>
+          <w:lang w:val="en-AU"/>
+        </w:rPr>
+        <w:br w:type="page"/>
+      </w:r>
+    </w:p>
+    <w:p>
+      <w:pPr>
+        <w:spacing w:after="40"/>
+        <w:rPr>
+          <w:lang w:val="en-AU"/>
+        </w:rPr>
       </w:pPr>
       <w:r>
         <w:rPr>
           <w:b/>
           <w:color w:val="00A6A6"/>
           <w:sz w:val="16"/>
+          <w:lang w:val="en-AU"/>
         </w:rPr>
         <w:lastRenderedPageBreak/>
         <w:t>PAGE 3 OF 3</w:t>
@@ -1919,33 +2693,53 @@
     <w:p>
       <w:pPr>
         <w:pStyle w:val="Heading1"/>
-      </w:pPr>
-      <w:r>
+        <w:rPr>
+          <w:lang w:val="en-AU"/>
+        </w:rPr>
+      </w:pPr>
+      <w:r>
+        <w:rPr>
+          <w:lang w:val="en-AU"/>
+        </w:rPr>
         <w:t>4. Activities, Roles and Schedule</w:t>
       </w:r>
     </w:p>
     <w:p>
-      <w:r>
-        <w:t>To keep things organi</w:t>
-      </w:r>
-      <w:r>
-        <w:t>s</w:t>
-      </w:r>
-      <w:r>
-        <w:t xml:space="preserve">ed, </w:t>
-      </w:r>
-      <w:r>
-        <w:t>our</w:t>
-      </w:r>
-      <w:r>
-        <w:t xml:space="preserve"> team will use a shared repository, a task board, and hold weekly check-ins. We will make sure to document all major decisions regarding scope, data, and modeling. Also, to ensure accuracy, every analytical output will be peer-reviewed by another team member before it goes into the final report.</w:t>
+      <w:pPr>
+        <w:rPr>
+          <w:lang w:val="en-AU"/>
+        </w:rPr>
+      </w:pPr>
+      <w:r>
+        <w:rPr>
+          <w:lang w:val="en-AU"/>
+        </w:rPr>
+        <w:t>To keep things organised, our team will use a shared repository, a task board, and hold weekly check-ins. We will make sure to document all major decisions regarding scope, data, and mode</w:t>
+      </w:r>
+      <w:r>
+        <w:rPr>
+          <w:lang w:val="en-AU"/>
+        </w:rPr>
+        <w:t>l</w:t>
+      </w:r>
+      <w:r>
+        <w:rPr>
+          <w:lang w:val="en-AU"/>
+        </w:rPr>
+        <w:t>ling. Also, to ensure accuracy, every analytical output will be peer-reviewed by another team member before it goes into the final report.</w:t>
       </w:r>
     </w:p>
     <w:p>
       <w:pPr>
         <w:pStyle w:val="Heading2"/>
-      </w:pPr>
-      <w:r>
+        <w:rPr>
+          <w:lang w:val="en-AU"/>
+        </w:rPr>
+      </w:pPr>
+      <w:r>
+        <w:rPr>
+          <w:lang w:val="en-AU"/>
+        </w:rPr>
         <w:t>Role allocation and justification</w:t>
       </w:r>
     </w:p>
@@ -1982,12 +2776,16 @@
             <w:pPr>
               <w:spacing w:after="0"/>
               <w:jc w:val="center"/>
+              <w:rPr>
+                <w:lang w:val="en-AU"/>
+              </w:rPr>
             </w:pPr>
             <w:r>
               <w:rPr>
                 <w:b/>
                 <w:color w:val="FFFFFF"/>
                 <w:sz w:val="14"/>
+                <w:lang w:val="en-AU"/>
               </w:rPr>
               <w:t>Member</w:t>
             </w:r>
@@ -2009,12 +2807,16 @@
             <w:pPr>
               <w:spacing w:after="0"/>
               <w:jc w:val="center"/>
+              <w:rPr>
+                <w:lang w:val="en-AU"/>
+              </w:rPr>
             </w:pPr>
             <w:r>
               <w:rPr>
                 <w:b/>
                 <w:color w:val="FFFFFF"/>
                 <w:sz w:val="14"/>
+                <w:lang w:val="en-AU"/>
               </w:rPr>
               <w:t>Primary role</w:t>
             </w:r>
@@ -2036,12 +2838,16 @@
             <w:pPr>
               <w:spacing w:after="0"/>
               <w:jc w:val="center"/>
+              <w:rPr>
+                <w:lang w:val="en-AU"/>
+              </w:rPr>
             </w:pPr>
             <w:r>
               <w:rPr>
                 <w:b/>
                 <w:color w:val="FFFFFF"/>
                 <w:sz w:val="14"/>
+                <w:lang w:val="en-AU"/>
               </w:rPr>
               <w:t>Responsibilities</w:t>
             </w:r>
@@ -2063,12 +2869,16 @@
             <w:pPr>
               <w:spacing w:after="0"/>
               <w:jc w:val="center"/>
+              <w:rPr>
+                <w:lang w:val="en-AU"/>
+              </w:rPr>
             </w:pPr>
             <w:r>
               <w:rPr>
                 <w:b/>
                 <w:color w:val="FFFFFF"/>
                 <w:sz w:val="14"/>
+                <w:lang w:val="en-AU"/>
               </w:rPr>
               <w:t>Justification</w:t>
             </w:r>
@@ -2094,11 +2904,15 @@
           <w:p>
             <w:pPr>
               <w:spacing w:after="0"/>
+              <w:rPr>
+                <w:lang w:val="en-AU"/>
+              </w:rPr>
             </w:pPr>
             <w:r>
               <w:rPr>
                 <w:color w:val="1F2937"/>
                 <w:sz w:val="14"/>
+                <w:lang w:val="en-AU"/>
               </w:rPr>
               <w:t>Bel Zhou</w:t>
             </w:r>
@@ -2119,11 +2933,15 @@
           <w:p>
             <w:pPr>
               <w:spacing w:after="0"/>
+              <w:rPr>
+                <w:lang w:val="en-AU"/>
+              </w:rPr>
             </w:pPr>
             <w:r>
               <w:rPr>
                 <w:color w:val="1F2937"/>
                 <w:sz w:val="14"/>
+                <w:lang w:val="en-AU"/>
               </w:rPr>
               <w:t>Data Engineer / Researcher</w:t>
             </w:r>
@@ -2144,11 +2962,15 @@
           <w:p>
             <w:pPr>
               <w:spacing w:after="0"/>
+              <w:rPr>
+                <w:lang w:val="en-AU"/>
+              </w:rPr>
             </w:pPr>
             <w:r>
               <w:rPr>
                 <w:color w:val="1F2937"/>
                 <w:sz w:val="14"/>
+                <w:lang w:val="en-AU"/>
               </w:rPr>
               <w:t>Acquiring, joining, and validating data; maintaining the data dictionary; supporting literature reviews and interpretation.</w:t>
             </w:r>
@@ -2169,11 +2991,15 @@
           <w:p>
             <w:pPr>
               <w:spacing w:after="0"/>
+              <w:rPr>
+                <w:lang w:val="en-AU"/>
+              </w:rPr>
             </w:pPr>
             <w:r>
               <w:rPr>
                 <w:color w:val="1F2937"/>
                 <w:sz w:val="14"/>
+                <w:lang w:val="en-AU"/>
               </w:rPr>
               <w:t>SQL, Python, data validation and analytics background.</w:t>
             </w:r>
@@ -2199,13 +3025,19 @@
           <w:p>
             <w:pPr>
               <w:spacing w:after="0"/>
-            </w:pPr>
-            <w:r>
               <w:rPr>
                 <w:color w:val="1F2937"/>
                 <w:sz w:val="14"/>
-              </w:rPr>
-              <w:t>[Member 2]</w:t>
+                <w:lang w:val="en-AU"/>
+              </w:rPr>
+            </w:pPr>
+            <w:r>
+              <w:rPr>
+                <w:color w:val="1F2937"/>
+                <w:sz w:val="14"/>
+                <w:lang w:val="en-AU"/>
+              </w:rPr>
+              <w:t>Anders Appel</w:t>
             </w:r>
           </w:p>
         </w:tc>
@@ -2224,7 +3056,28 @@
           <w:p>
             <w:pPr>
               <w:spacing w:after="0"/>
-            </w:pPr>
+              <w:rPr>
+                <w:color w:val="1F2937"/>
+                <w:sz w:val="14"/>
+                <w:lang w:val="en-AU"/>
+              </w:rPr>
+            </w:pPr>
+            <w:r>
+              <w:rPr>
+                <w:color w:val="1F2937"/>
+                <w:sz w:val="14"/>
+                <w:lang w:val="en-AU"/>
+              </w:rPr>
+              <w:t xml:space="preserve">Data Engineer / </w:t>
+            </w:r>
+            <w:r>
+              <w:rPr>
+                <w:color w:val="1F2937"/>
+                <w:sz w:val="14"/>
+                <w:lang w:val="en-AU"/>
+              </w:rPr>
+              <w:t>Analyst</w:t>
+            </w:r>
           </w:p>
         </w:tc>
         <w:tc>
@@ -2242,7 +3095,60 @@
           <w:p>
             <w:pPr>
               <w:spacing w:after="0"/>
-            </w:pPr>
+              <w:rPr>
+                <w:color w:val="1F2937"/>
+                <w:sz w:val="14"/>
+                <w:lang w:val="en-AU"/>
+              </w:rPr>
+            </w:pPr>
+            <w:r>
+              <w:rPr>
+                <w:color w:val="1F2937"/>
+                <w:sz w:val="14"/>
+                <w:lang w:val="en-AU"/>
+              </w:rPr>
+              <w:t xml:space="preserve">Acquiring, joining and validating data; building </w:t>
+            </w:r>
+            <w:r>
+              <w:rPr>
+                <w:color w:val="1F2937"/>
+                <w:sz w:val="14"/>
+                <w:lang w:val="en-AU"/>
+              </w:rPr>
+              <w:t xml:space="preserve">robust and </w:t>
+            </w:r>
+            <w:r>
+              <w:rPr>
+                <w:color w:val="1F2937"/>
+                <w:sz w:val="14"/>
+                <w:lang w:val="en-AU"/>
+              </w:rPr>
+              <w:t>structured data pipelines</w:t>
+            </w:r>
+            <w:r>
+              <w:rPr>
+                <w:color w:val="1F2937"/>
+                <w:sz w:val="14"/>
+                <w:lang w:val="en-AU"/>
+              </w:rPr>
+              <w:t>; data modelling and analysis; supporting</w:t>
+            </w:r>
+            <w:r>
+              <w:rPr>
+                <w:color w:val="1F2937"/>
+                <w:sz w:val="14"/>
+                <w:lang w:val="en-AU"/>
+              </w:rPr>
+              <w:t xml:space="preserve"> report drafting and </w:t>
+            </w:r>
+            <w:r>
+              <w:rPr>
+                <w:color w:val="1F2937"/>
+                <w:sz w:val="14"/>
+                <w:lang w:val="en-AU"/>
+              </w:rPr>
+              <w:t>interpretation of results.</w:t>
+            </w:r>
           </w:p>
         </w:tc>
         <w:tc>
@@ -2260,7 +3166,54 @@
           <w:p>
             <w:pPr>
               <w:spacing w:after="0"/>
-            </w:pPr>
+              <w:rPr>
+                <w:color w:val="1F2937"/>
+                <w:sz w:val="14"/>
+                <w:lang w:val="en-AU"/>
+              </w:rPr>
+            </w:pPr>
+            <w:r>
+              <w:rPr>
+                <w:color w:val="1F2937"/>
+                <w:sz w:val="14"/>
+                <w:lang w:val="en-AU"/>
+              </w:rPr>
+              <w:t xml:space="preserve">Experience with data modelling in </w:t>
+            </w:r>
+            <w:proofErr w:type="gramStart"/>
+            <w:r>
+              <w:rPr>
+                <w:color w:val="1F2937"/>
+                <w:sz w:val="14"/>
+                <w:lang w:val="en-AU"/>
+              </w:rPr>
+              <w:t>Python, and</w:t>
+            </w:r>
+            <w:proofErr w:type="gramEnd"/>
+            <w:r>
+              <w:rPr>
+                <w:color w:val="1F2937"/>
+                <w:sz w:val="14"/>
+                <w:lang w:val="en-AU"/>
+              </w:rPr>
+              <w:t xml:space="preserve"> </w:t>
+            </w:r>
+            <w:r>
+              <w:rPr>
+                <w:color w:val="1F2937"/>
+                <w:sz w:val="14"/>
+                <w:lang w:val="en-AU"/>
+              </w:rPr>
+              <w:t xml:space="preserve">using Git for </w:t>
+            </w:r>
+            <w:r>
+              <w:rPr>
+                <w:color w:val="1F2937"/>
+                <w:sz w:val="14"/>
+                <w:lang w:val="en-AU"/>
+              </w:rPr>
+              <w:t>collaborative software development.</w:t>
+            </w:r>
           </w:p>
         </w:tc>
       </w:tr>
@@ -2283,11 +3236,15 @@
           <w:p>
             <w:pPr>
               <w:spacing w:after="0"/>
+              <w:rPr>
+                <w:lang w:val="en-AU"/>
+              </w:rPr>
             </w:pPr>
             <w:r>
               <w:rPr>
                 <w:color w:val="1F2937"/>
                 <w:sz w:val="14"/>
+                <w:lang w:val="en-AU"/>
               </w:rPr>
               <w:t>[Member 3]</w:t>
             </w:r>
@@ -2308,6 +3265,9 @@
           <w:p>
             <w:pPr>
               <w:spacing w:after="0"/>
+              <w:rPr>
+                <w:lang w:val="en-AU"/>
+              </w:rPr>
             </w:pPr>
           </w:p>
         </w:tc>
@@ -2326,6 +3286,9 @@
           <w:p>
             <w:pPr>
               <w:spacing w:after="0"/>
+              <w:rPr>
+                <w:lang w:val="en-AU"/>
+              </w:rPr>
             </w:pPr>
           </w:p>
         </w:tc>
@@ -2344,6 +3307,9 @@
           <w:p>
             <w:pPr>
               <w:spacing w:after="0"/>
+              <w:rPr>
+                <w:lang w:val="en-AU"/>
+              </w:rPr>
             </w:pPr>
           </w:p>
         </w:tc>
@@ -2352,8 +3318,14 @@
     <w:p>
       <w:pPr>
         <w:pStyle w:val="Heading2"/>
-      </w:pPr>
-      <w:r>
+        <w:rPr>
+          <w:lang w:val="en-AU"/>
+        </w:rPr>
+      </w:pPr>
+      <w:r>
+        <w:rPr>
+          <w:lang w:val="en-AU"/>
+        </w:rPr>
         <w:t>Week 2 to Week 6 work plan</w:t>
       </w:r>
     </w:p>
@@ -2392,12 +3364,16 @@
             <w:pPr>
               <w:spacing w:after="0"/>
               <w:jc w:val="center"/>
+              <w:rPr>
+                <w:lang w:val="en-AU"/>
+              </w:rPr>
             </w:pPr>
             <w:r>
               <w:rPr>
                 <w:b/>
                 <w:color w:val="FFFFFF"/>
                 <w:sz w:val="15"/>
+                <w:lang w:val="en-AU"/>
               </w:rPr>
               <w:t>Activity</w:t>
             </w:r>
@@ -2419,12 +3395,16 @@
             <w:pPr>
               <w:spacing w:after="0"/>
               <w:jc w:val="center"/>
+              <w:rPr>
+                <w:lang w:val="en-AU"/>
+              </w:rPr>
             </w:pPr>
             <w:r>
               <w:rPr>
                 <w:b/>
                 <w:color w:val="FFFFFF"/>
                 <w:sz w:val="15"/>
+                <w:lang w:val="en-AU"/>
               </w:rPr>
               <w:t>W2</w:t>
             </w:r>
@@ -2446,12 +3426,16 @@
             <w:pPr>
               <w:spacing w:after="0"/>
               <w:jc w:val="center"/>
+              <w:rPr>
+                <w:lang w:val="en-AU"/>
+              </w:rPr>
             </w:pPr>
             <w:r>
               <w:rPr>
                 <w:b/>
                 <w:color w:val="FFFFFF"/>
                 <w:sz w:val="15"/>
+                <w:lang w:val="en-AU"/>
               </w:rPr>
               <w:t>W3</w:t>
             </w:r>
@@ -2473,12 +3457,16 @@
             <w:pPr>
               <w:spacing w:after="0"/>
               <w:jc w:val="center"/>
+              <w:rPr>
+                <w:lang w:val="en-AU"/>
+              </w:rPr>
             </w:pPr>
             <w:r>
               <w:rPr>
                 <w:b/>
                 <w:color w:val="FFFFFF"/>
                 <w:sz w:val="15"/>
+                <w:lang w:val="en-AU"/>
               </w:rPr>
               <w:t>W4</w:t>
             </w:r>
@@ -2500,12 +3488,16 @@
             <w:pPr>
               <w:spacing w:after="0"/>
               <w:jc w:val="center"/>
+              <w:rPr>
+                <w:lang w:val="en-AU"/>
+              </w:rPr>
             </w:pPr>
             <w:r>
               <w:rPr>
                 <w:b/>
                 <w:color w:val="FFFFFF"/>
                 <w:sz w:val="15"/>
+                <w:lang w:val="en-AU"/>
               </w:rPr>
               <w:t>W5</w:t>
             </w:r>
@@ -2527,12 +3519,16 @@
             <w:pPr>
               <w:spacing w:after="0"/>
               <w:jc w:val="center"/>
+              <w:rPr>
+                <w:lang w:val="en-AU"/>
+              </w:rPr>
             </w:pPr>
             <w:r>
               <w:rPr>
                 <w:b/>
                 <w:color w:val="FFFFFF"/>
                 <w:sz w:val="15"/>
+                <w:lang w:val="en-AU"/>
               </w:rPr>
               <w:t>W6</w:t>
             </w:r>
@@ -2557,11 +3553,15 @@
           <w:p>
             <w:pPr>
               <w:spacing w:after="0"/>
+              <w:rPr>
+                <w:lang w:val="en-AU"/>
+              </w:rPr>
             </w:pPr>
             <w:r>
               <w:rPr>
                 <w:color w:val="1F2937"/>
                 <w:sz w:val="14"/>
+                <w:lang w:val="en-AU"/>
               </w:rPr>
               <w:t>Topic, plan and roles</w:t>
             </w:r>
@@ -2583,12 +3583,16 @@
             <w:pPr>
               <w:spacing w:after="0"/>
               <w:jc w:val="center"/>
+              <w:rPr>
+                <w:lang w:val="en-AU"/>
+              </w:rPr>
             </w:pPr>
             <w:r>
               <w:rPr>
                 <w:b/>
                 <w:color w:val="FFFFFF"/>
                 <w:sz w:val="16"/>
+                <w:lang w:val="en-AU"/>
               </w:rPr>
               <w:t>●</w:t>
             </w:r>
@@ -2610,6 +3614,9 @@
             <w:pPr>
               <w:spacing w:after="0"/>
               <w:jc w:val="center"/>
+              <w:rPr>
+                <w:lang w:val="en-AU"/>
+              </w:rPr>
             </w:pPr>
           </w:p>
         </w:tc>
@@ -2629,6 +3636,9 @@
             <w:pPr>
               <w:spacing w:after="0"/>
               <w:jc w:val="center"/>
+              <w:rPr>
+                <w:lang w:val="en-AU"/>
+              </w:rPr>
             </w:pPr>
           </w:p>
         </w:tc>
@@ -2648,6 +3658,9 @@
             <w:pPr>
               <w:spacing w:after="0"/>
               <w:jc w:val="center"/>
+              <w:rPr>
+                <w:lang w:val="en-AU"/>
+              </w:rPr>
             </w:pPr>
           </w:p>
         </w:tc>
@@ -2667,6 +3680,9 @@
             <w:pPr>
               <w:spacing w:after="0"/>
               <w:jc w:val="center"/>
+              <w:rPr>
+                <w:lang w:val="en-AU"/>
+              </w:rPr>
             </w:pPr>
           </w:p>
         </w:tc>
@@ -2689,11 +3705,15 @@
           <w:p>
             <w:pPr>
               <w:spacing w:after="0"/>
+              <w:rPr>
+                <w:lang w:val="en-AU"/>
+              </w:rPr>
             </w:pPr>
             <w:r>
               <w:rPr>
                 <w:color w:val="1F2937"/>
                 <w:sz w:val="14"/>
+                <w:lang w:val="en-AU"/>
               </w:rPr>
               <w:t>Literature review</w:t>
             </w:r>
@@ -2715,12 +3735,16 @@
             <w:pPr>
               <w:spacing w:after="0"/>
               <w:jc w:val="center"/>
+              <w:rPr>
+                <w:lang w:val="en-AU"/>
+              </w:rPr>
             </w:pPr>
             <w:r>
               <w:rPr>
                 <w:b/>
                 <w:color w:val="FFFFFF"/>
                 <w:sz w:val="16"/>
+                <w:lang w:val="en-AU"/>
               </w:rPr>
               <w:t>●</w:t>
             </w:r>
@@ -2742,12 +3766,16 @@
             <w:pPr>
               <w:spacing w:after="0"/>
               <w:jc w:val="center"/>
+              <w:rPr>
+                <w:lang w:val="en-AU"/>
+              </w:rPr>
             </w:pPr>
             <w:r>
               <w:rPr>
                 <w:b/>
                 <w:color w:val="FFFFFF"/>
                 <w:sz w:val="16"/>
+                <w:lang w:val="en-AU"/>
               </w:rPr>
               <w:t>●</w:t>
             </w:r>
@@ -2769,6 +3797,9 @@
             <w:pPr>
               <w:spacing w:after="0"/>
               <w:jc w:val="center"/>
+              <w:rPr>
+                <w:lang w:val="en-AU"/>
+              </w:rPr>
             </w:pPr>
           </w:p>
         </w:tc>
@@ -2788,6 +3819,9 @@
             <w:pPr>
               <w:spacing w:after="0"/>
               <w:jc w:val="center"/>
+              <w:rPr>
+                <w:lang w:val="en-AU"/>
+              </w:rPr>
             </w:pPr>
           </w:p>
         </w:tc>
@@ -2807,6 +3841,9 @@
             <w:pPr>
               <w:spacing w:after="0"/>
               <w:jc w:val="center"/>
+              <w:rPr>
+                <w:lang w:val="en-AU"/>
+              </w:rPr>
             </w:pPr>
           </w:p>
         </w:tc>
@@ -2829,11 +3866,15 @@
           <w:p>
             <w:pPr>
               <w:spacing w:after="0"/>
+              <w:rPr>
+                <w:lang w:val="en-AU"/>
+              </w:rPr>
             </w:pPr>
             <w:r>
               <w:rPr>
                 <w:color w:val="1F2937"/>
                 <w:sz w:val="14"/>
+                <w:lang w:val="en-AU"/>
               </w:rPr>
               <w:t>Data collection and cleaning</w:t>
             </w:r>
@@ -2855,12 +3896,16 @@
             <w:pPr>
               <w:spacing w:after="0"/>
               <w:jc w:val="center"/>
+              <w:rPr>
+                <w:lang w:val="en-AU"/>
+              </w:rPr>
             </w:pPr>
             <w:r>
               <w:rPr>
                 <w:b/>
                 <w:color w:val="FFFFFF"/>
                 <w:sz w:val="16"/>
+                <w:lang w:val="en-AU"/>
               </w:rPr>
               <w:t>●</w:t>
             </w:r>
@@ -2882,12 +3927,16 @@
             <w:pPr>
               <w:spacing w:after="0"/>
               <w:jc w:val="center"/>
+              <w:rPr>
+                <w:lang w:val="en-AU"/>
+              </w:rPr>
             </w:pPr>
             <w:r>
               <w:rPr>
                 <w:b/>
                 <w:color w:val="FFFFFF"/>
                 <w:sz w:val="16"/>
+                <w:lang w:val="en-AU"/>
               </w:rPr>
               <w:t>●</w:t>
             </w:r>
@@ -2909,12 +3958,16 @@
             <w:pPr>
               <w:spacing w:after="0"/>
               <w:jc w:val="center"/>
+              <w:rPr>
+                <w:lang w:val="en-AU"/>
+              </w:rPr>
             </w:pPr>
             <w:r>
               <w:rPr>
                 <w:b/>
                 <w:color w:val="FFFFFF"/>
                 <w:sz w:val="16"/>
+                <w:lang w:val="en-AU"/>
               </w:rPr>
               <w:t>●</w:t>
             </w:r>
@@ -2936,6 +3989,9 @@
             <w:pPr>
               <w:spacing w:after="0"/>
               <w:jc w:val="center"/>
+              <w:rPr>
+                <w:lang w:val="en-AU"/>
+              </w:rPr>
             </w:pPr>
           </w:p>
         </w:tc>
@@ -2955,6 +4011,9 @@
             <w:pPr>
               <w:spacing w:after="0"/>
               <w:jc w:val="center"/>
+              <w:rPr>
+                <w:lang w:val="en-AU"/>
+              </w:rPr>
             </w:pPr>
           </w:p>
         </w:tc>
@@ -2977,11 +4036,15 @@
           <w:p>
             <w:pPr>
               <w:spacing w:after="0"/>
+              <w:rPr>
+                <w:lang w:val="en-AU"/>
+              </w:rPr>
             </w:pPr>
             <w:r>
               <w:rPr>
                 <w:color w:val="1F2937"/>
                 <w:sz w:val="14"/>
+                <w:lang w:val="en-AU"/>
               </w:rPr>
               <w:t>EDA and feature engineering</w:t>
             </w:r>
@@ -3003,6 +4066,9 @@
             <w:pPr>
               <w:spacing w:after="0"/>
               <w:jc w:val="center"/>
+              <w:rPr>
+                <w:lang w:val="en-AU"/>
+              </w:rPr>
             </w:pPr>
           </w:p>
         </w:tc>
@@ -3022,12 +4088,16 @@
             <w:pPr>
               <w:spacing w:after="0"/>
               <w:jc w:val="center"/>
+              <w:rPr>
+                <w:lang w:val="en-AU"/>
+              </w:rPr>
             </w:pPr>
             <w:r>
               <w:rPr>
                 <w:b/>
                 <w:color w:val="FFFFFF"/>
                 <w:sz w:val="16"/>
+                <w:lang w:val="en-AU"/>
               </w:rPr>
               <w:t>●</w:t>
             </w:r>
@@ -3049,12 +4119,16 @@
             <w:pPr>
               <w:spacing w:after="0"/>
               <w:jc w:val="center"/>
+              <w:rPr>
+                <w:lang w:val="en-AU"/>
+              </w:rPr>
             </w:pPr>
             <w:r>
               <w:rPr>
                 <w:b/>
                 <w:color w:val="FFFFFF"/>
                 <w:sz w:val="16"/>
+                <w:lang w:val="en-AU"/>
               </w:rPr>
               <w:t>●</w:t>
             </w:r>
@@ -3076,6 +4150,9 @@
             <w:pPr>
               <w:spacing w:after="0"/>
               <w:jc w:val="center"/>
+              <w:rPr>
+                <w:lang w:val="en-AU"/>
+              </w:rPr>
             </w:pPr>
           </w:p>
         </w:tc>
@@ -3095,6 +4172,9 @@
             <w:pPr>
               <w:spacing w:after="0"/>
               <w:jc w:val="center"/>
+              <w:rPr>
+                <w:lang w:val="en-AU"/>
+              </w:rPr>
             </w:pPr>
           </w:p>
         </w:tc>
@@ -3117,11 +4197,15 @@
           <w:p>
             <w:pPr>
               <w:spacing w:after="0"/>
+              <w:rPr>
+                <w:lang w:val="en-AU"/>
+              </w:rPr>
             </w:pPr>
             <w:r>
               <w:rPr>
                 <w:color w:val="1F2937"/>
                 <w:sz w:val="14"/>
+                <w:lang w:val="en-AU"/>
               </w:rPr>
               <w:t>Modelling and analysis</w:t>
             </w:r>
@@ -3143,6 +4227,9 @@
             <w:pPr>
               <w:spacing w:after="0"/>
               <w:jc w:val="center"/>
+              <w:rPr>
+                <w:lang w:val="en-AU"/>
+              </w:rPr>
             </w:pPr>
           </w:p>
         </w:tc>
@@ -3162,6 +4249,9 @@
             <w:pPr>
               <w:spacing w:after="0"/>
               <w:jc w:val="center"/>
+              <w:rPr>
+                <w:lang w:val="en-AU"/>
+              </w:rPr>
             </w:pPr>
           </w:p>
         </w:tc>
@@ -3181,12 +4271,16 @@
             <w:pPr>
               <w:spacing w:after="0"/>
               <w:jc w:val="center"/>
+              <w:rPr>
+                <w:lang w:val="en-AU"/>
+              </w:rPr>
             </w:pPr>
             <w:r>
               <w:rPr>
                 <w:b/>
                 <w:color w:val="FFFFFF"/>
                 <w:sz w:val="16"/>
+                <w:lang w:val="en-AU"/>
               </w:rPr>
               <w:t>●</w:t>
             </w:r>
@@ -3208,12 +4302,16 @@
             <w:pPr>
               <w:spacing w:after="0"/>
               <w:jc w:val="center"/>
+              <w:rPr>
+                <w:lang w:val="en-AU"/>
+              </w:rPr>
             </w:pPr>
             <w:r>
               <w:rPr>
                 <w:b/>
                 <w:color w:val="FFFFFF"/>
                 <w:sz w:val="16"/>
+                <w:lang w:val="en-AU"/>
               </w:rPr>
               <w:t>●</w:t>
             </w:r>
@@ -3235,6 +4333,9 @@
             <w:pPr>
               <w:spacing w:after="0"/>
               <w:jc w:val="center"/>
+              <w:rPr>
+                <w:lang w:val="en-AU"/>
+              </w:rPr>
             </w:pPr>
           </w:p>
         </w:tc>
@@ -3257,11 +4358,15 @@
           <w:p>
             <w:pPr>
               <w:spacing w:after="0"/>
+              <w:rPr>
+                <w:lang w:val="en-AU"/>
+              </w:rPr>
             </w:pPr>
             <w:r>
               <w:rPr>
                 <w:color w:val="1F2937"/>
                 <w:sz w:val="14"/>
+                <w:lang w:val="en-AU"/>
               </w:rPr>
               <w:t>Visualisation and interpretation</w:t>
             </w:r>
@@ -3283,6 +4388,9 @@
             <w:pPr>
               <w:spacing w:after="0"/>
               <w:jc w:val="center"/>
+              <w:rPr>
+                <w:lang w:val="en-AU"/>
+              </w:rPr>
             </w:pPr>
           </w:p>
         </w:tc>
@@ -3302,6 +4410,9 @@
             <w:pPr>
               <w:spacing w:after="0"/>
               <w:jc w:val="center"/>
+              <w:rPr>
+                <w:lang w:val="en-AU"/>
+              </w:rPr>
             </w:pPr>
           </w:p>
         </w:tc>
@@ -3321,6 +4432,9 @@
             <w:pPr>
               <w:spacing w:after="0"/>
               <w:jc w:val="center"/>
+              <w:rPr>
+                <w:lang w:val="en-AU"/>
+              </w:rPr>
             </w:pPr>
           </w:p>
         </w:tc>
@@ -3340,12 +4454,16 @@
             <w:pPr>
               <w:spacing w:after="0"/>
               <w:jc w:val="center"/>
+              <w:rPr>
+                <w:lang w:val="en-AU"/>
+              </w:rPr>
             </w:pPr>
             <w:r>
               <w:rPr>
                 <w:b/>
                 <w:color w:val="FFFFFF"/>
                 <w:sz w:val="16"/>
+                <w:lang w:val="en-AU"/>
               </w:rPr>
               <w:t>●</w:t>
             </w:r>
@@ -3367,12 +4485,16 @@
             <w:pPr>
               <w:spacing w:after="0"/>
               <w:jc w:val="center"/>
+              <w:rPr>
+                <w:lang w:val="en-AU"/>
+              </w:rPr>
             </w:pPr>
             <w:r>
               <w:rPr>
                 <w:b/>
                 <w:color w:val="FFFFFF"/>
                 <w:sz w:val="16"/>
+                <w:lang w:val="en-AU"/>
               </w:rPr>
               <w:t>●</w:t>
             </w:r>
@@ -3397,11 +4519,15 @@
           <w:p>
             <w:pPr>
               <w:spacing w:after="0"/>
+              <w:rPr>
+                <w:lang w:val="en-AU"/>
+              </w:rPr>
             </w:pPr>
             <w:r>
               <w:rPr>
                 <w:color w:val="1F2937"/>
                 <w:sz w:val="14"/>
+                <w:lang w:val="en-AU"/>
               </w:rPr>
               <w:t>Report writing</w:t>
             </w:r>
@@ -3423,6 +4549,9 @@
             <w:pPr>
               <w:spacing w:after="0"/>
               <w:jc w:val="center"/>
+              <w:rPr>
+                <w:lang w:val="en-AU"/>
+              </w:rPr>
             </w:pPr>
           </w:p>
         </w:tc>
@@ -3442,6 +4571,9 @@
             <w:pPr>
               <w:spacing w:after="0"/>
               <w:jc w:val="center"/>
+              <w:rPr>
+                <w:lang w:val="en-AU"/>
+              </w:rPr>
             </w:pPr>
           </w:p>
         </w:tc>
@@ -3461,12 +4593,16 @@
             <w:pPr>
               <w:spacing w:after="0"/>
               <w:jc w:val="center"/>
+              <w:rPr>
+                <w:lang w:val="en-AU"/>
+              </w:rPr>
             </w:pPr>
             <w:r>
               <w:rPr>
                 <w:b/>
                 <w:color w:val="FFFFFF"/>
                 <w:sz w:val="16"/>
+                <w:lang w:val="en-AU"/>
               </w:rPr>
               <w:t>●</w:t>
             </w:r>
@@ -3488,12 +4624,16 @@
             <w:pPr>
               <w:spacing w:after="0"/>
               <w:jc w:val="center"/>
+              <w:rPr>
+                <w:lang w:val="en-AU"/>
+              </w:rPr>
             </w:pPr>
             <w:r>
               <w:rPr>
                 <w:b/>
                 <w:color w:val="FFFFFF"/>
                 <w:sz w:val="16"/>
+                <w:lang w:val="en-AU"/>
               </w:rPr>
               <w:t>●</w:t>
             </w:r>
@@ -3515,12 +4655,16 @@
             <w:pPr>
               <w:spacing w:after="0"/>
               <w:jc w:val="center"/>
+              <w:rPr>
+                <w:lang w:val="en-AU"/>
+              </w:rPr>
             </w:pPr>
             <w:r>
               <w:rPr>
                 <w:b/>
                 <w:color w:val="FFFFFF"/>
                 <w:sz w:val="16"/>
+                <w:lang w:val="en-AU"/>
               </w:rPr>
               <w:t>●</w:t>
             </w:r>
@@ -3545,11 +4689,15 @@
           <w:p>
             <w:pPr>
               <w:spacing w:after="0"/>
+              <w:rPr>
+                <w:lang w:val="en-AU"/>
+              </w:rPr>
             </w:pPr>
             <w:r>
               <w:rPr>
                 <w:color w:val="1F2937"/>
                 <w:sz w:val="14"/>
+                <w:lang w:val="en-AU"/>
               </w:rPr>
               <w:t>Final review and submission</w:t>
             </w:r>
@@ -3571,6 +4719,9 @@
             <w:pPr>
               <w:spacing w:after="0"/>
               <w:jc w:val="center"/>
+              <w:rPr>
+                <w:lang w:val="en-AU"/>
+              </w:rPr>
             </w:pPr>
           </w:p>
         </w:tc>
@@ -3590,6 +4741,9 @@
             <w:pPr>
               <w:spacing w:after="0"/>
               <w:jc w:val="center"/>
+              <w:rPr>
+                <w:lang w:val="en-AU"/>
+              </w:rPr>
             </w:pPr>
           </w:p>
         </w:tc>
@@ -3609,6 +4763,9 @@
             <w:pPr>
               <w:spacing w:after="0"/>
               <w:jc w:val="center"/>
+              <w:rPr>
+                <w:lang w:val="en-AU"/>
+              </w:rPr>
             </w:pPr>
           </w:p>
         </w:tc>
@@ -3628,6 +4785,9 @@
             <w:pPr>
               <w:spacing w:after="0"/>
               <w:jc w:val="center"/>
+              <w:rPr>
+                <w:lang w:val="en-AU"/>
+              </w:rPr>
             </w:pPr>
           </w:p>
         </w:tc>
@@ -3647,12 +4807,16 @@
             <w:pPr>
               <w:spacing w:after="0"/>
               <w:jc w:val="center"/>
+              <w:rPr>
+                <w:lang w:val="en-AU"/>
+              </w:rPr>
             </w:pPr>
             <w:r>
               <w:rPr>
                 <w:b/>
                 <w:color w:val="FFFFFF"/>
                 <w:sz w:val="16"/>
+                <w:lang w:val="en-AU"/>
               </w:rPr>
               <w:t>●</w:t>
             </w:r>
@@ -3663,34 +4827,30 @@
     <w:p>
       <w:pPr>
         <w:jc w:val="center"/>
+        <w:rPr>
+          <w:lang w:val="en-AU"/>
+        </w:rPr>
       </w:pPr>
       <w:r>
         <w:rPr>
           <w:i/>
           <w:sz w:val="15"/>
-        </w:rPr>
-        <w:t xml:space="preserve">Figure 1. Project schedule from Week 2 through </w:t>
-      </w:r>
-      <w:r>
-        <w:rPr>
-          <w:i/>
-          <w:sz w:val="15"/>
-        </w:rPr>
-        <w:t>Week</w:t>
-      </w:r>
-      <w:r>
-        <w:rPr>
-          <w:i/>
-          <w:sz w:val="15"/>
-        </w:rPr>
-        <w:t xml:space="preserve"> 6 report submission.</w:t>
+          <w:lang w:val="en-AU"/>
+        </w:rPr>
+        <w:t>Figure 1. Project schedule from Week 2 through Week 6 report submission.</w:t>
       </w:r>
     </w:p>
     <w:p>
       <w:pPr>
         <w:pStyle w:val="Heading2"/>
-      </w:pPr>
-      <w:r>
+        <w:rPr>
+          <w:lang w:val="en-AU"/>
+        </w:rPr>
+      </w:pPr>
+      <w:r>
+        <w:rPr>
+          <w:lang w:val="en-AU"/>
+        </w:rPr>
         <w:t>Weekly deliverables</w:t>
       </w:r>
     </w:p>
@@ -3698,46 +4858,44 @@
       <w:pPr>
         <w:spacing w:after="40"/>
         <w:ind w:left="245" w:hanging="173"/>
+        <w:rPr>
+          <w:lang w:val="en-AU"/>
+        </w:rPr>
       </w:pPr>
       <w:r>
         <w:rPr>
           <w:sz w:val="16"/>
+          <w:lang w:val="en-AU"/>
         </w:rPr>
         <w:t xml:space="preserve">•  Week 2: </w:t>
       </w:r>
       <w:r>
         <w:rPr>
           <w:sz w:val="16"/>
-        </w:rPr>
-        <w:t>Finali</w:t>
-      </w:r>
-      <w:r>
-        <w:rPr>
-          <w:sz w:val="16"/>
-        </w:rPr>
-        <w:t>s</w:t>
-      </w:r>
-      <w:r>
-        <w:rPr>
-          <w:sz w:val="16"/>
-        </w:rPr>
-        <w:t>e the topic, project plan, roles, literature sources, and target datasets.</w:t>
+          <w:lang w:val="en-AU"/>
+        </w:rPr>
+        <w:t>Finalise the topic, project plan, roles, literature sources, and target datasets.</w:t>
       </w:r>
     </w:p>
     <w:p>
       <w:pPr>
         <w:spacing w:after="40"/>
         <w:ind w:left="245" w:hanging="173"/>
+        <w:rPr>
+          <w:lang w:val="en-AU"/>
+        </w:rPr>
       </w:pPr>
       <w:r>
         <w:rPr>
           <w:sz w:val="16"/>
+          <w:lang w:val="en-AU"/>
         </w:rPr>
         <w:t xml:space="preserve">•  Week 3: </w:t>
       </w:r>
       <w:r>
         <w:rPr>
           <w:sz w:val="16"/>
+          <w:lang w:val="en-AU"/>
         </w:rPr>
         <w:t>Collect, clean, and align AEMO and weather data, then finish the initial EDA.</w:t>
       </w:r>
@@ -3746,16 +4904,21 @@
       <w:pPr>
         <w:spacing w:after="40"/>
         <w:ind w:left="245" w:hanging="173"/>
+        <w:rPr>
+          <w:lang w:val="en-AU"/>
+        </w:rPr>
       </w:pPr>
       <w:r>
         <w:rPr>
           <w:sz w:val="16"/>
+          <w:lang w:val="en-AU"/>
         </w:rPr>
         <w:t xml:space="preserve">•  Week 4: </w:t>
       </w:r>
       <w:r>
         <w:rPr>
           <w:sz w:val="16"/>
+          <w:lang w:val="en-AU"/>
         </w:rPr>
         <w:t>Work on feature engineering, run correlation and regression analyses, and start drafting the report.</w:t>
       </w:r>
@@ -3764,30 +4927,23 @@
       <w:pPr>
         <w:spacing w:after="40"/>
         <w:ind w:left="245" w:hanging="173"/>
+        <w:rPr>
+          <w:lang w:val="en-AU"/>
+        </w:rPr>
       </w:pPr>
       <w:r>
         <w:rPr>
           <w:sz w:val="16"/>
+          <w:lang w:val="en-AU"/>
         </w:rPr>
         <w:t xml:space="preserve">•  Week 5: </w:t>
       </w:r>
       <w:r>
         <w:rPr>
           <w:sz w:val="16"/>
-        </w:rPr>
-        <w:t xml:space="preserve">Refine the models, try to test an ML </w:t>
-      </w:r>
-      <w:r>
-        <w:rPr>
-          <w:sz w:val="16"/>
-        </w:rPr>
-        <w:t>benchmark,</w:t>
-      </w:r>
-      <w:r>
-        <w:rPr>
-          <w:sz w:val="16"/>
-        </w:rPr>
-        <w:t xml:space="preserve"> if possible, create visuals, and interpret the results.</w:t>
+          <w:lang w:val="en-AU"/>
+        </w:rPr>
+        <w:t>Refine the models, try to test an ML benchmark, if possible, create visuals, and interpret the results.</w:t>
       </w:r>
     </w:p>
     <w:p>
@@ -3796,31 +4952,22 @@
         <w:ind w:left="245" w:hanging="173"/>
         <w:rPr>
           <w:sz w:val="16"/>
+          <w:lang w:val="en-AU"/>
         </w:rPr>
       </w:pPr>
       <w:r>
         <w:rPr>
           <w:sz w:val="16"/>
+          <w:lang w:val="en-AU"/>
         </w:rPr>
         <w:t xml:space="preserve">•  Week 6: </w:t>
       </w:r>
       <w:r>
         <w:rPr>
           <w:sz w:val="16"/>
-        </w:rPr>
-        <w:t>Wrap up the analysis, pull the report together, review and proofread everything, and submit</w:t>
-      </w:r>
-      <w:r>
-        <w:rPr>
-          <w:sz w:val="16"/>
-        </w:rPr>
-        <w:t xml:space="preserve"> the project report and work on video presentation</w:t>
-      </w:r>
-      <w:r>
-        <w:rPr>
-          <w:sz w:val="16"/>
-        </w:rPr>
-        <w:t>.</w:t>
+          <w:lang w:val="en-AU"/>
+        </w:rPr>
+        <w:t>Wrap up the analysis, pull the report together, review and proofread everything, and submit the project report and work on video presentation.</w:t>
       </w:r>
     </w:p>
     <w:p>
@@ -3829,23 +4976,36 @@
         <w:ind w:left="245" w:hanging="173"/>
         <w:rPr>
           <w:sz w:val="16"/>
+          <w:lang w:val="en-AU"/>
         </w:rPr>
       </w:pPr>
     </w:p>
     <w:p>
-      <w:r>
+      <w:pPr>
+        <w:rPr>
+          <w:lang w:val="en-AU"/>
+        </w:rPr>
+      </w:pPr>
+      <w:r>
+        <w:rPr>
+          <w:lang w:val="en-AU"/>
+        </w:rPr>
         <w:br w:type="page"/>
       </w:r>
     </w:p>
     <w:p>
       <w:pPr>
         <w:spacing w:after="40"/>
+        <w:rPr>
+          <w:lang w:val="en-AU"/>
+        </w:rPr>
       </w:pPr>
       <w:r>
         <w:rPr>
           <w:b/>
           <w:color w:val="00A6A6"/>
           <w:sz w:val="16"/>
+          <w:lang w:val="en-AU"/>
         </w:rPr>
         <w:lastRenderedPageBreak/>
         <w:t>REFERENCES | EXCLUDED FROM PAGE COUNT</w:t>
@@ -3854,8 +5014,14 @@
     <w:p>
       <w:pPr>
         <w:pStyle w:val="Heading1"/>
-      </w:pPr>
-      <w:r>
+        <w:rPr>
+          <w:lang w:val="en-AU"/>
+        </w:rPr>
+      </w:pPr>
+      <w:r>
+        <w:rPr>
+          <w:lang w:val="en-AU"/>
+        </w:rPr>
         <w:t>References</w:t>
       </w:r>
     </w:p>
@@ -3863,8 +5029,14 @@
       <w:pPr>
         <w:spacing w:after="140"/>
         <w:ind w:left="360" w:hanging="360"/>
-      </w:pPr>
-      <w:r>
+        <w:rPr>
+          <w:lang w:val="en-AU"/>
+        </w:rPr>
+      </w:pPr>
+      <w:r>
+        <w:rPr>
+          <w:lang w:val="en-AU"/>
+        </w:rPr>
         <w:t>Australian Energy Market Operator (AEMO) 2026a, Australian Solar Energy Forecasting System, AEMO, viewed 5 September 2026.</w:t>
       </w:r>
     </w:p>
@@ -3872,8 +5044,14 @@
       <w:pPr>
         <w:spacing w:after="140"/>
         <w:ind w:left="360" w:hanging="360"/>
-      </w:pPr>
-      <w:r>
+        <w:rPr>
+          <w:lang w:val="en-AU"/>
+        </w:rPr>
+      </w:pPr>
+      <w:r>
+        <w:rPr>
+          <w:lang w:val="en-AU"/>
+        </w:rPr>
         <w:t>Australian Energy Market Operator (AEMO) 2026b, MMS Data Model Report: ROOFTOP_PV_ACTUAL, AEMO, viewed 5 September 2026.</w:t>
       </w:r>
     </w:p>
@@ -3881,8 +5059,14 @@
       <w:pPr>
         <w:spacing w:after="140"/>
         <w:ind w:left="360" w:hanging="360"/>
-      </w:pPr>
-      <w:r>
+        <w:rPr>
+          <w:lang w:val="en-AU"/>
+        </w:rPr>
+      </w:pPr>
+      <w:r>
+        <w:rPr>
+          <w:lang w:val="en-AU"/>
+        </w:rPr>
         <w:t>Australian Energy Market Operator (AEMO) 2026c, Operational demand data, AEMO, viewed 5 September 2026.</w:t>
       </w:r>
     </w:p>
@@ -3890,18 +5074,127 @@
       <w:pPr>
         <w:spacing w:after="140"/>
         <w:ind w:left="360" w:hanging="360"/>
-      </w:pPr>
-      <w:r>
-        <w:t>Houchati, M, Beitelmal, AH &amp; Khraisheh, M 2022, “Predictive Modeling for Rooftop Solar Energy Throughput: A Machine Learning-Based Optimization for Building Energy Demand Scheduling”, Journal of Energy Resources Technology, vol. 144, no. 1, article 011302.</w:t>
+        <w:rPr>
+          <w:lang w:val="en-AU"/>
+        </w:rPr>
+      </w:pPr>
+      <w:proofErr w:type="spellStart"/>
+      <w:r>
+        <w:rPr>
+          <w:lang w:val="en-AU"/>
+        </w:rPr>
+        <w:t>Houchati</w:t>
+      </w:r>
+      <w:proofErr w:type="spellEnd"/>
+      <w:r>
+        <w:rPr>
+          <w:lang w:val="en-AU"/>
+        </w:rPr>
+        <w:t xml:space="preserve">, M, </w:t>
+      </w:r>
+      <w:proofErr w:type="spellStart"/>
+      <w:r>
+        <w:rPr>
+          <w:lang w:val="en-AU"/>
+        </w:rPr>
+        <w:t>Beitelmal</w:t>
+      </w:r>
+      <w:proofErr w:type="spellEnd"/>
+      <w:r>
+        <w:rPr>
+          <w:lang w:val="en-AU"/>
+        </w:rPr>
+        <w:t xml:space="preserve">, AH &amp; </w:t>
+      </w:r>
+      <w:proofErr w:type="spellStart"/>
+      <w:r>
+        <w:rPr>
+          <w:lang w:val="en-AU"/>
+        </w:rPr>
+        <w:t>Khraisheh</w:t>
+      </w:r>
+      <w:proofErr w:type="spellEnd"/>
+      <w:r>
+        <w:rPr>
+          <w:lang w:val="en-AU"/>
+        </w:rPr>
+        <w:t>, M 2022, “Predictive Mode</w:t>
+      </w:r>
+      <w:r>
+        <w:rPr>
+          <w:lang w:val="en-AU"/>
+        </w:rPr>
+        <w:t>l</w:t>
+      </w:r>
+      <w:r>
+        <w:rPr>
+          <w:lang w:val="en-AU"/>
+        </w:rPr>
+        <w:t>ling for Rooftop Solar Energy Throughput: A Machine Learning-Based Optimization for Building Energy Demand Scheduling”, Journal of Energy Resources Technology, vol. 144, no. 1, article 011302.</w:t>
       </w:r>
     </w:p>
     <w:p>
       <w:pPr>
         <w:spacing w:after="140"/>
         <w:ind w:left="360" w:hanging="360"/>
-      </w:pPr>
-      <w:r>
+        <w:rPr>
+          <w:lang w:val="en-AU"/>
+        </w:rPr>
+      </w:pPr>
+      <w:r>
+        <w:rPr>
+          <w:lang w:val="en-AU"/>
+        </w:rPr>
         <w:t>Yan, G &amp; Han, L 2023, “The impact of rooftop solar on wholesale electricity demand in the Australian National Electricity Market”, Frontiers in Energy Research, vol. 11, article 1197504.</w:t>
+      </w:r>
+    </w:p>
+    <w:p>
+      <w:pPr>
+        <w:spacing w:after="140"/>
+        <w:ind w:left="360" w:hanging="360"/>
+      </w:pPr>
+      <w:r>
+        <w:t>Bae, D-J, Kwon, B-S &amp; Song, K-B 2021, '</w:t>
+      </w:r>
+      <w:proofErr w:type="spellStart"/>
+      <w:r>
+        <w:t>XGBoost</w:t>
+      </w:r>
+      <w:proofErr w:type="spellEnd"/>
+      <w:r>
+        <w:t xml:space="preserve">-Based Day-Ahead Load Forecasting Algorithm Considering Behind-the-Meter Solar PV Generation', </w:t>
+      </w:r>
+      <w:r>
+        <w:rPr>
+          <w:i/>
+          <w:iCs/>
+        </w:rPr>
+        <w:t>Energies</w:t>
+      </w:r>
+      <w:r>
+        <w:t>, vol. 15, no. 1, article 128.</w:t>
+      </w:r>
+    </w:p>
+    <w:p>
+      <w:pPr>
+        <w:spacing w:after="140"/>
+        <w:ind w:left="360" w:hanging="360"/>
+        <w:rPr>
+          <w:lang w:val="en-AU"/>
+        </w:rPr>
+      </w:pPr>
+      <w:r>
+        <w:t xml:space="preserve">Yildiz, B, Bilbao, JI, Dore, J &amp; Sproul, AB 2018, 'Short-term forecasting of individual household electricity loads with investigating impact of data resolution and forecast horizon', </w:t>
+      </w:r>
+      <w:r>
+        <w:rPr>
+          <w:i/>
+          <w:iCs/>
+        </w:rPr>
+        <w:t>Renewable Energy and Environmental Sustainability</w:t>
+      </w:r>
+      <w:r>
+        <w:t>, vol. 3, article 3.</w:t>
       </w:r>
     </w:p>
     <w:sectPr>
@@ -3917,7 +5210,7 @@
 </file>
 
 <file path=word/endnotes.xml><?xml version="1.0" encoding="utf-8"?>
-<w:endnotes xmlns:wpc="http://schemas.microsoft.com/office/word/2010/wordprocessingCanvas" xmlns:cx="http://schemas.microsoft.com/office/drawing/2014/chartex" xmlns:cx1="http://schemas.microsoft.com/office/drawing/2015/9/8/chartex" xmlns:cx2="http://schemas.microsoft.com/office/drawing/2015/10/21/chartex" xmlns:cx3="http://schemas.microsoft.com/office/drawing/2016/5/9/chartex" xmlns:cx4="http://schemas.microsoft.com/office/drawing/2016/5/10/chartex" xmlns:cx5="http://schemas.microsoft.com/office/drawing/2016/5/11/chartex" xmlns:cx6="http://schemas.microsoft.com/office/drawing/2016/5/12/chartex" xmlns:cx7="http://schemas.microsoft.com/office/drawing/2016/5/13/chartex" xmlns:cx8="http://schemas.microsoft.com/office/drawing/2016/5/14/chartex" xmlns:mc="http://schemas.openxmlformats.org/markup-compatibility/2006" xmlns:aink="http://schemas.microsoft.com/office/drawing/2016/ink" xmlns:am3d="http://schemas.microsoft.com/office/drawing/2017/model3d" xmlns:o="urn:schemas-microsoft-com:office:office" xmlns:oel="http://schemas.microsoft.com/office/2019/extlst" xmlns:r="http://schemas.openxmlformats.org/officeDocument/2006/relationships" xmlns:m="http://schemas.openxmlformats.org/officeDocument/2006/math" xmlns:v="urn:schemas-microsoft-com:vml" xmlns:wp14="http://schemas.microsoft.com/office/word/2010/wordprocessingDrawing" xmlns:wp="http://schemas.openxmlformats.org/drawingml/2006/wordprocessingDrawing" xmlns:w10="urn:schemas-microsoft-com:office:word" xmlns:w="http://schemas.openxmlformats.org/wordprocessingml/2006/main" xmlns:w14="http://schemas.microsoft.com/office/word/2010/wordml" xmlns:w15="http://schemas.microsoft.com/office/word/2012/wordml" xmlns:w16cei="http://schemas.microsoft.com/office/word/2026/wordml/cei" xmlns:w16cex="http://schemas.microsoft.com/office/word/2018/wordml/cex" xmlns:w16cid="http://schemas.microsoft.com/office/word/2016/wordml/cid" xmlns:w16="http://schemas.microsoft.com/office/word/2018/wordml" xmlns:w16du="http://schemas.microsoft.com/office/word/2023/wordml/word16du" xmlns:w16sdtdh="http://schemas.microsoft.com/office/word/2020/wordml/sdtdatahash" xmlns:w16sdtfl="http://schemas.microsoft.com/office/word/2024/wordml/sdtformatlock" xmlns:w16se="http://schemas.microsoft.com/office/word/2015/wordml/symex" xmlns:wpg="http://schemas.microsoft.com/office/word/2010/wordprocessingGroup" xmlns:wpi="http://schemas.microsoft.com/office/word/2010/wordprocessingInk" xmlns:wne="http://schemas.microsoft.com/office/word/2006/wordml" xmlns:wps="http://schemas.microsoft.com/office/word/2010/wordprocessingShape" mc:Ignorable="w14 w15 w16se w16cid w16 w16cex w16sdtdh w16sdtfl w16du wp14">
+<w:endnotes xmlns:wpc="http://schemas.microsoft.com/office/word/2010/wordprocessingCanvas" xmlns:cx="http://schemas.microsoft.com/office/drawing/2014/chartex" xmlns:cx1="http://schemas.microsoft.com/office/drawing/2015/9/8/chartex" xmlns:cx2="http://schemas.microsoft.com/office/drawing/2015/10/21/chartex" xmlns:cx3="http://schemas.microsoft.com/office/drawing/2016/5/9/chartex" xmlns:cx4="http://schemas.microsoft.com/office/drawing/2016/5/10/chartex" xmlns:cx5="http://schemas.microsoft.com/office/drawing/2016/5/11/chartex" xmlns:cx6="http://schemas.microsoft.com/office/drawing/2016/5/12/chartex" xmlns:cx7="http://schemas.microsoft.com/office/drawing/2016/5/13/chartex" xmlns:cx8="http://schemas.microsoft.com/office/drawing/2016/5/14/chartex" xmlns:mc="http://schemas.openxmlformats.org/markup-compatibility/2006" xmlns:aink="http://schemas.microsoft.com/office/drawing/2016/ink" xmlns:am3d="http://schemas.microsoft.com/office/drawing/2017/model3d" xmlns:o="urn:schemas-microsoft-com:office:office" xmlns:oel="http://schemas.microsoft.com/office/2019/extlst" xmlns:r="http://schemas.openxmlformats.org/officeDocument/2006/relationships" xmlns:m="http://schemas.openxmlformats.org/officeDocument/2006/math" xmlns:v="urn:schemas-microsoft-com:vml" xmlns:wp14="http://schemas.microsoft.com/office/word/2010/wordprocessingDrawing" xmlns:wp="http://schemas.openxmlformats.org/drawingml/2006/wordprocessingDrawing" xmlns:w10="urn:schemas-microsoft-com:office:word" xmlns:w="http://schemas.openxmlformats.org/wordprocessingml/2006/main" xmlns:w14="http://schemas.microsoft.com/office/word/2010/wordml" xmlns:w15="http://schemas.microsoft.com/office/word/2012/wordml" xmlns:w16cex="http://schemas.microsoft.com/office/word/2018/wordml/cex" xmlns:w16cid="http://schemas.microsoft.com/office/word/2016/wordml/cid" xmlns:w16="http://schemas.microsoft.com/office/word/2018/wordml" xmlns:w16du="http://schemas.microsoft.com/office/word/2023/wordml/word16du" xmlns:w16sdtdh="http://schemas.microsoft.com/office/word/2020/wordml/sdtdatahash" xmlns:w16sdtfl="http://schemas.microsoft.com/office/word/2024/wordml/sdtformatlock" xmlns:w16se="http://schemas.microsoft.com/office/word/2015/wordml/symex" xmlns:wpg="http://schemas.microsoft.com/office/word/2010/wordprocessingGroup" xmlns:wpi="http://schemas.microsoft.com/office/word/2010/wordprocessingInk" xmlns:wne="http://schemas.microsoft.com/office/word/2006/wordml" xmlns:wps="http://schemas.microsoft.com/office/word/2010/wordprocessingShape" mc:Ignorable="w14 w15 w16se w16cid w16 w16cex w16sdtdh w16sdtfl w16du wp14">
   <w:endnote w:type="separator" w:id="-1">
     <w:p>
       <w:pPr>
@@ -3942,7 +5235,7 @@
 </file>
 
 <file path=word/footer1.xml><?xml version="1.0" encoding="utf-8"?>
-<w:ftr xmlns:wpc="http://schemas.microsoft.com/office/word/2010/wordprocessingCanvas" xmlns:cx="http://schemas.microsoft.com/office/drawing/2014/chartex" xmlns:cx1="http://schemas.microsoft.com/office/drawing/2015/9/8/chartex" xmlns:cx2="http://schemas.microsoft.com/office/drawing/2015/10/21/chartex" xmlns:cx3="http://schemas.microsoft.com/office/drawing/2016/5/9/chartex" xmlns:cx4="http://schemas.microsoft.com/office/drawing/2016/5/10/chartex" xmlns:cx5="http://schemas.microsoft.com/office/drawing/2016/5/11/chartex" xmlns:cx6="http://schemas.microsoft.com/office/drawing/2016/5/12/chartex" xmlns:cx7="http://schemas.microsoft.com/office/drawing/2016/5/13/chartex" xmlns:cx8="http://schemas.microsoft.com/office/drawing/2016/5/14/chartex" xmlns:mc="http://schemas.openxmlformats.org/markup-compatibility/2006" xmlns:aink="http://schemas.microsoft.com/office/drawing/2016/ink" xmlns:am3d="http://schemas.microsoft.com/office/drawing/2017/model3d" xmlns:o="urn:schemas-microsoft-com:office:office" xmlns:oel="http://schemas.microsoft.com/office/2019/extlst" xmlns:r="http://schemas.openxmlformats.org/officeDocument/2006/relationships" xmlns:m="http://schemas.openxmlformats.org/officeDocument/2006/math" xmlns:v="urn:schemas-microsoft-com:vml" xmlns:wp14="http://schemas.microsoft.com/office/word/2010/wordprocessingDrawing" xmlns:wp="http://schemas.openxmlformats.org/drawingml/2006/wordprocessingDrawing" xmlns:w10="urn:schemas-microsoft-com:office:word" xmlns:w="http://schemas.openxmlformats.org/wordprocessingml/2006/main" xmlns:w14="http://schemas.microsoft.com/office/word/2010/wordml" xmlns:w15="http://schemas.microsoft.com/office/word/2012/wordml" xmlns:w16cei="http://schemas.microsoft.com/office/word/2026/wordml/cei" xmlns:w16cex="http://schemas.microsoft.com/office/word/2018/wordml/cex" xmlns:w16cid="http://schemas.microsoft.com/office/word/2016/wordml/cid" xmlns:w16="http://schemas.microsoft.com/office/word/2018/wordml" xmlns:w16du="http://schemas.microsoft.com/office/word/2023/wordml/word16du" xmlns:w16sdtdh="http://schemas.microsoft.com/office/word/2020/wordml/sdtdatahash" xmlns:w16sdtfl="http://schemas.microsoft.com/office/word/2024/wordml/sdtformatlock" xmlns:w16se="http://schemas.microsoft.com/office/word/2015/wordml/symex" xmlns:wpg="http://schemas.microsoft.com/office/word/2010/wordprocessingGroup" xmlns:wpi="http://schemas.microsoft.com/office/word/2010/wordprocessingInk" xmlns:wne="http://schemas.microsoft.com/office/word/2006/wordml" xmlns:wps="http://schemas.microsoft.com/office/word/2010/wordprocessingShape" mc:Ignorable="w14 w15 w16se w16cid w16 w16cex w16sdtdh w16sdtfl w16du wp14">
+<w:ftr xmlns:wpc="http://schemas.microsoft.com/office/word/2010/wordprocessingCanvas" xmlns:cx="http://schemas.microsoft.com/office/drawing/2014/chartex" xmlns:cx1="http://schemas.microsoft.com/office/drawing/2015/9/8/chartex" xmlns:cx2="http://schemas.microsoft.com/office/drawing/2015/10/21/chartex" xmlns:cx3="http://schemas.microsoft.com/office/drawing/2016/5/9/chartex" xmlns:cx4="http://schemas.microsoft.com/office/drawing/2016/5/10/chartex" xmlns:cx5="http://schemas.microsoft.com/office/drawing/2016/5/11/chartex" xmlns:cx6="http://schemas.microsoft.com/office/drawing/2016/5/12/chartex" xmlns:cx7="http://schemas.microsoft.com/office/drawing/2016/5/13/chartex" xmlns:cx8="http://schemas.microsoft.com/office/drawing/2016/5/14/chartex" xmlns:mc="http://schemas.openxmlformats.org/markup-compatibility/2006" xmlns:aink="http://schemas.microsoft.com/office/drawing/2016/ink" xmlns:am3d="http://schemas.microsoft.com/office/drawing/2017/model3d" xmlns:o="urn:schemas-microsoft-com:office:office" xmlns:oel="http://schemas.microsoft.com/office/2019/extlst" xmlns:r="http://schemas.openxmlformats.org/officeDocument/2006/relationships" xmlns:m="http://schemas.openxmlformats.org/officeDocument/2006/math" xmlns:v="urn:schemas-microsoft-com:vml" xmlns:wp14="http://schemas.microsoft.com/office/word/2010/wordprocessingDrawing" xmlns:wp="http://schemas.openxmlformats.org/drawingml/2006/wordprocessingDrawing" xmlns:w10="urn:schemas-microsoft-com:office:word" xmlns:w="http://schemas.openxmlformats.org/wordprocessingml/2006/main" xmlns:w14="http://schemas.microsoft.com/office/word/2010/wordml" xmlns:w15="http://schemas.microsoft.com/office/word/2012/wordml" xmlns:w16cex="http://schemas.microsoft.com/office/word/2018/wordml/cex" xmlns:w16cid="http://schemas.microsoft.com/office/word/2016/wordml/cid" xmlns:w16="http://schemas.microsoft.com/office/word/2018/wordml" xmlns:w16du="http://schemas.microsoft.com/office/word/2023/wordml/word16du" xmlns:w16sdtdh="http://schemas.microsoft.com/office/word/2020/wordml/sdtdatahash" xmlns:w16sdtfl="http://schemas.microsoft.com/office/word/2024/wordml/sdtformatlock" xmlns:w16se="http://schemas.microsoft.com/office/word/2015/wordml/symex" xmlns:wpg="http://schemas.microsoft.com/office/word/2010/wordprocessingGroup" xmlns:wpi="http://schemas.microsoft.com/office/word/2010/wordprocessingInk" xmlns:wne="http://schemas.microsoft.com/office/word/2006/wordml" xmlns:wps="http://schemas.microsoft.com/office/word/2010/wordprocessingShape" mc:Ignorable="w14 w15 w16se w16cid w16 w16cex w16sdtdh w16sdtfl w16du wp14">
   <w:p>
     <w:pPr>
       <w:pStyle w:val="Footer"/>
@@ -3952,7 +5245,7 @@
 </file>
 
 <file path=word/footer2.xml><?xml version="1.0" encoding="utf-8"?>
-<w:ftr xmlns:wpc="http://schemas.microsoft.com/office/word/2010/wordprocessingCanvas" xmlns:cx="http://schemas.microsoft.com/office/drawing/2014/chartex" xmlns:cx1="http://schemas.microsoft.com/office/drawing/2015/9/8/chartex" xmlns:cx2="http://schemas.microsoft.com/office/drawing/2015/10/21/chartex" xmlns:cx3="http://schemas.microsoft.com/office/drawing/2016/5/9/chartex" xmlns:cx4="http://schemas.microsoft.com/office/drawing/2016/5/10/chartex" xmlns:cx5="http://schemas.microsoft.com/office/drawing/2016/5/11/chartex" xmlns:cx6="http://schemas.microsoft.com/office/drawing/2016/5/12/chartex" xmlns:cx7="http://schemas.microsoft.com/office/drawing/2016/5/13/chartex" xmlns:cx8="http://schemas.microsoft.com/office/drawing/2016/5/14/chartex" xmlns:mc="http://schemas.openxmlformats.org/markup-compatibility/2006" xmlns:aink="http://schemas.microsoft.com/office/drawing/2016/ink" xmlns:am3d="http://schemas.microsoft.com/office/drawing/2017/model3d" xmlns:o="urn:schemas-microsoft-com:office:office" xmlns:oel="http://schemas.microsoft.com/office/2019/extlst" xmlns:r="http://schemas.openxmlformats.org/officeDocument/2006/relationships" xmlns:m="http://schemas.openxmlformats.org/officeDocument/2006/math" xmlns:v="urn:schemas-microsoft-com:vml" xmlns:wp14="http://schemas.microsoft.com/office/word/2010/wordprocessingDrawing" xmlns:wp="http://schemas.openxmlformats.org/drawingml/2006/wordprocessingDrawing" xmlns:w10="urn:schemas-microsoft-com:office:word" xmlns:w="http://schemas.openxmlformats.org/wordprocessingml/2006/main" xmlns:w14="http://schemas.microsoft.com/office/word/2010/wordml" xmlns:w15="http://schemas.microsoft.com/office/word/2012/wordml" xmlns:w16cei="http://schemas.microsoft.com/office/word/2026/wordml/cei" xmlns:w16cex="http://schemas.microsoft.com/office/word/2018/wordml/cex" xmlns:w16cid="http://schemas.microsoft.com/office/word/2016/wordml/cid" xmlns:w16="http://schemas.microsoft.com/office/word/2018/wordml" xmlns:w16du="http://schemas.microsoft.com/office/word/2023/wordml/word16du" xmlns:w16sdtdh="http://schemas.microsoft.com/office/word/2020/wordml/sdtdatahash" xmlns:w16sdtfl="http://schemas.microsoft.com/office/word/2024/wordml/sdtformatlock" xmlns:w16se="http://schemas.microsoft.com/office/word/2015/wordml/symex" xmlns:wpg="http://schemas.microsoft.com/office/word/2010/wordprocessingGroup" xmlns:wpi="http://schemas.microsoft.com/office/word/2010/wordprocessingInk" xmlns:wne="http://schemas.microsoft.com/office/word/2006/wordml" xmlns:wps="http://schemas.microsoft.com/office/word/2010/wordprocessingShape" mc:Ignorable="w14 w15 w16se w16cid w16 w16cex w16sdtdh w16sdtfl w16du wp14">
+<w:ftr xmlns:wpc="http://schemas.microsoft.com/office/word/2010/wordprocessingCanvas" xmlns:cx="http://schemas.microsoft.com/office/drawing/2014/chartex" xmlns:cx1="http://schemas.microsoft.com/office/drawing/2015/9/8/chartex" xmlns:cx2="http://schemas.microsoft.com/office/drawing/2015/10/21/chartex" xmlns:cx3="http://schemas.microsoft.com/office/drawing/2016/5/9/chartex" xmlns:cx4="http://schemas.microsoft.com/office/drawing/2016/5/10/chartex" xmlns:cx5="http://schemas.microsoft.com/office/drawing/2016/5/11/chartex" xmlns:cx6="http://schemas.microsoft.com/office/drawing/2016/5/12/chartex" xmlns:cx7="http://schemas.microsoft.com/office/drawing/2016/5/13/chartex" xmlns:cx8="http://schemas.microsoft.com/office/drawing/2016/5/14/chartex" xmlns:mc="http://schemas.openxmlformats.org/markup-compatibility/2006" xmlns:aink="http://schemas.microsoft.com/office/drawing/2016/ink" xmlns:am3d="http://schemas.microsoft.com/office/drawing/2017/model3d" xmlns:o="urn:schemas-microsoft-com:office:office" xmlns:oel="http://schemas.microsoft.com/office/2019/extlst" xmlns:r="http://schemas.openxmlformats.org/officeDocument/2006/relationships" xmlns:m="http://schemas.openxmlformats.org/officeDocument/2006/math" xmlns:v="urn:schemas-microsoft-com:vml" xmlns:wp14="http://schemas.microsoft.com/office/word/2010/wordprocessingDrawing" xmlns:wp="http://schemas.openxmlformats.org/drawingml/2006/wordprocessingDrawing" xmlns:w10="urn:schemas-microsoft-com:office:word" xmlns:w="http://schemas.openxmlformats.org/wordprocessingml/2006/main" xmlns:w14="http://schemas.microsoft.com/office/word/2010/wordml" xmlns:w15="http://schemas.microsoft.com/office/word/2012/wordml" xmlns:w16cex="http://schemas.microsoft.com/office/word/2018/wordml/cex" xmlns:w16cid="http://schemas.microsoft.com/office/word/2016/wordml/cid" xmlns:w16="http://schemas.microsoft.com/office/word/2018/wordml" xmlns:w16du="http://schemas.microsoft.com/office/word/2023/wordml/word16du" xmlns:w16sdtdh="http://schemas.microsoft.com/office/word/2020/wordml/sdtdatahash" xmlns:w16sdtfl="http://schemas.microsoft.com/office/word/2024/wordml/sdtformatlock" xmlns:w16se="http://schemas.microsoft.com/office/word/2015/wordml/symex" xmlns:wpg="http://schemas.microsoft.com/office/word/2010/wordprocessingGroup" xmlns:wpi="http://schemas.microsoft.com/office/word/2010/wordprocessingInk" xmlns:wne="http://schemas.microsoft.com/office/word/2006/wordml" xmlns:wps="http://schemas.microsoft.com/office/word/2010/wordprocessingShape" mc:Ignorable="w14 w15 w16se w16cid w16 w16cex w16sdtdh w16sdtfl w16du wp14">
   <w:p>
     <w:pPr>
       <w:pStyle w:val="Footer"/>
@@ -3966,7 +5259,7 @@
 </file>
 
 <file path=word/footer3.xml><?xml version="1.0" encoding="utf-8"?>
-<w:ftr xmlns:wpc="http://schemas.microsoft.com/office/word/2010/wordprocessingCanvas" xmlns:cx="http://schemas.microsoft.com/office/drawing/2014/chartex" xmlns:cx1="http://schemas.microsoft.com/office/drawing/2015/9/8/chartex" xmlns:cx2="http://schemas.microsoft.com/office/drawing/2015/10/21/chartex" xmlns:cx3="http://schemas.microsoft.com/office/drawing/2016/5/9/chartex" xmlns:cx4="http://schemas.microsoft.com/office/drawing/2016/5/10/chartex" xmlns:cx5="http://schemas.microsoft.com/office/drawing/2016/5/11/chartex" xmlns:cx6="http://schemas.microsoft.com/office/drawing/2016/5/12/chartex" xmlns:cx7="http://schemas.microsoft.com/office/drawing/2016/5/13/chartex" xmlns:cx8="http://schemas.microsoft.com/office/drawing/2016/5/14/chartex" xmlns:mc="http://schemas.openxmlformats.org/markup-compatibility/2006" xmlns:aink="http://schemas.microsoft.com/office/drawing/2016/ink" xmlns:am3d="http://schemas.microsoft.com/office/drawing/2017/model3d" xmlns:o="urn:schemas-microsoft-com:office:office" xmlns:oel="http://schemas.microsoft.com/office/2019/extlst" xmlns:r="http://schemas.openxmlformats.org/officeDocument/2006/relationships" xmlns:m="http://schemas.openxmlformats.org/officeDocument/2006/math" xmlns:v="urn:schemas-microsoft-com:vml" xmlns:wp14="http://schemas.microsoft.com/office/word/2010/wordprocessingDrawing" xmlns:wp="http://schemas.openxmlformats.org/drawingml/2006/wordprocessingDrawing" xmlns:w10="urn:schemas-microsoft-com:office:word" xmlns:w="http://schemas.openxmlformats.org/wordprocessingml/2006/main" xmlns:w14="http://schemas.microsoft.com/office/word/2010/wordml" xmlns:w15="http://schemas.microsoft.com/office/word/2012/wordml" xmlns:w16cei="http://schemas.microsoft.com/office/word/2026/wordml/cei" xmlns:w16cex="http://schemas.microsoft.com/office/word/2018/wordml/cex" xmlns:w16cid="http://schemas.microsoft.com/office/word/2016/wordml/cid" xmlns:w16="http://schemas.microsoft.com/office/word/2018/wordml" xmlns:w16du="http://schemas.microsoft.com/office/word/2023/wordml/word16du" xmlns:w16sdtdh="http://schemas.microsoft.com/office/word/2020/wordml/sdtdatahash" xmlns:w16sdtfl="http://schemas.microsoft.com/office/word/2024/wordml/sdtformatlock" xmlns:w16se="http://schemas.microsoft.com/office/word/2015/wordml/symex" xmlns:wpg="http://schemas.microsoft.com/office/word/2010/wordprocessingGroup" xmlns:wpi="http://schemas.microsoft.com/office/word/2010/wordprocessingInk" xmlns:wne="http://schemas.microsoft.com/office/word/2006/wordml" xmlns:wps="http://schemas.microsoft.com/office/word/2010/wordprocessingShape" mc:Ignorable="w14 w15 w16se w16cid w16 w16cex w16sdtdh w16sdtfl w16du wp14">
+<w:ftr xmlns:wpc="http://schemas.microsoft.com/office/word/2010/wordprocessingCanvas" xmlns:cx="http://schemas.microsoft.com/office/drawing/2014/chartex" xmlns:cx1="http://schemas.microsoft.com/office/drawing/2015/9/8/chartex" xmlns:cx2="http://schemas.microsoft.com/office/drawing/2015/10/21/chartex" xmlns:cx3="http://schemas.microsoft.com/office/drawing/2016/5/9/chartex" xmlns:cx4="http://schemas.microsoft.com/office/drawing/2016/5/10/chartex" xmlns:cx5="http://schemas.microsoft.com/office/drawing/2016/5/11/chartex" xmlns:cx6="http://schemas.microsoft.com/office/drawing/2016/5/12/chartex" xmlns:cx7="http://schemas.microsoft.com/office/drawing/2016/5/13/chartex" xmlns:cx8="http://schemas.microsoft.com/office/drawing/2016/5/14/chartex" xmlns:mc="http://schemas.openxmlformats.org/markup-compatibility/2006" xmlns:aink="http://schemas.microsoft.com/office/drawing/2016/ink" xmlns:am3d="http://schemas.microsoft.com/office/drawing/2017/model3d" xmlns:o="urn:schemas-microsoft-com:office:office" xmlns:oel="http://schemas.microsoft.com/office/2019/extlst" xmlns:r="http://schemas.openxmlformats.org/officeDocument/2006/relationships" xmlns:m="http://schemas.openxmlformats.org/officeDocument/2006/math" xmlns:v="urn:schemas-microsoft-com:vml" xmlns:wp14="http://schemas.microsoft.com/office/word/2010/wordprocessingDrawing" xmlns:wp="http://schemas.openxmlformats.org/drawingml/2006/wordprocessingDrawing" xmlns:w10="urn:schemas-microsoft-com:office:word" xmlns:w="http://schemas.openxmlformats.org/wordprocessingml/2006/main" xmlns:w14="http://schemas.microsoft.com/office/word/2010/wordml" xmlns:w15="http://schemas.microsoft.com/office/word/2012/wordml" xmlns:w16cex="http://schemas.microsoft.com/office/word/2018/wordml/cex" xmlns:w16cid="http://schemas.microsoft.com/office/word/2016/wordml/cid" xmlns:w16="http://schemas.microsoft.com/office/word/2018/wordml" xmlns:w16du="http://schemas.microsoft.com/office/word/2023/wordml/word16du" xmlns:w16sdtdh="http://schemas.microsoft.com/office/word/2020/wordml/sdtdatahash" xmlns:w16sdtfl="http://schemas.microsoft.com/office/word/2024/wordml/sdtformatlock" xmlns:w16se="http://schemas.microsoft.com/office/word/2015/wordml/symex" xmlns:wpg="http://schemas.microsoft.com/office/word/2010/wordprocessingGroup" xmlns:wpi="http://schemas.microsoft.com/office/word/2010/wordprocessingInk" xmlns:wne="http://schemas.microsoft.com/office/word/2006/wordml" xmlns:wps="http://schemas.microsoft.com/office/word/2010/wordprocessingShape" mc:Ignorable="w14 w15 w16se w16cid w16 w16cex w16sdtdh w16sdtfl w16du wp14">
   <w:p>
     <w:pPr>
       <w:pStyle w:val="Footer"/>
@@ -3976,7 +5269,7 @@
 </file>
 
 <file path=word/footnotes.xml><?xml version="1.0" encoding="utf-8"?>
-<w:footnotes xmlns:wpc="http://schemas.microsoft.com/office/word/2010/wordprocessingCanvas" xmlns:cx="http://schemas.microsoft.com/office/drawing/2014/chartex" xmlns:cx1="http://schemas.microsoft.com/office/drawing/2015/9/8/chartex" xmlns:cx2="http://schemas.microsoft.com/office/drawing/2015/10/21/chartex" xmlns:cx3="http://schemas.microsoft.com/office/drawing/2016/5/9/chartex" xmlns:cx4="http://schemas.microsoft.com/office/drawing/2016/5/10/chartex" xmlns:cx5="http://schemas.microsoft.com/office/drawing/2016/5/11/chartex" xmlns:cx6="http://schemas.microsoft.com/office/drawing/2016/5/12/chartex" xmlns:cx7="http://schemas.microsoft.com/office/drawing/2016/5/13/chartex" xmlns:cx8="http://schemas.microsoft.com/office/drawing/2016/5/14/chartex" xmlns:mc="http://schemas.openxmlformats.org/markup-compatibility/2006" xmlns:aink="http://schemas.microsoft.com/office/drawing/2016/ink" xmlns:am3d="http://schemas.microsoft.com/office/drawing/2017/model3d" xmlns:o="urn:schemas-microsoft-com:office:office" xmlns:oel="http://schemas.microsoft.com/office/2019/extlst" xmlns:r="http://schemas.openxmlformats.org/officeDocument/2006/relationships" xmlns:m="http://schemas.openxmlformats.org/officeDocument/2006/math" xmlns:v="urn:schemas-microsoft-com:vml" xmlns:wp14="http://schemas.microsoft.com/office/word/2010/wordprocessingDrawing" xmlns:wp="http://schemas.openxmlformats.org/drawingml/2006/wordprocessingDrawing" xmlns:w10="urn:schemas-microsoft-com:office:word" xmlns:w="http://schemas.openxmlformats.org/wordprocessingml/2006/main" xmlns:w14="http://schemas.microsoft.com/office/word/2010/wordml" xmlns:w15="http://schemas.microsoft.com/office/word/2012/wordml" xmlns:w16cei="http://schemas.microsoft.com/office/word/2026/wordml/cei" xmlns:w16cex="http://schemas.microsoft.com/office/word/2018/wordml/cex" xmlns:w16cid="http://schemas.microsoft.com/office/word/2016/wordml/cid" xmlns:w16="http://schemas.microsoft.com/office/word/2018/wordml" xmlns:w16du="http://schemas.microsoft.com/office/word/2023/wordml/word16du" xmlns:w16sdtdh="http://schemas.microsoft.com/office/word/2020/wordml/sdtdatahash" xmlns:w16sdtfl="http://schemas.microsoft.com/office/word/2024/wordml/sdtformatlock" xmlns:w16se="http://schemas.microsoft.com/office/word/2015/wordml/symex" xmlns:wpg="http://schemas.microsoft.com/office/word/2010/wordprocessingGroup" xmlns:wpi="http://schemas.microsoft.com/office/word/2010/wordprocessingInk" xmlns:wne="http://schemas.microsoft.com/office/word/2006/wordml" xmlns:wps="http://schemas.microsoft.com/office/word/2010/wordprocessingShape" mc:Ignorable="w14 w15 w16se w16cid w16 w16cex w16sdtdh w16sdtfl w16du wp14">
+<w:footnotes xmlns:wpc="http://schemas.microsoft.com/office/word/2010/wordprocessingCanvas" xmlns:cx="http://schemas.microsoft.com/office/drawing/2014/chartex" xmlns:cx1="http://schemas.microsoft.com/office/drawing/2015/9/8/chartex" xmlns:cx2="http://schemas.microsoft.com/office/drawing/2015/10/21/chartex" xmlns:cx3="http://schemas.microsoft.com/office/drawing/2016/5/9/chartex" xmlns:cx4="http://schemas.microsoft.com/office/drawing/2016/5/10/chartex" xmlns:cx5="http://schemas.microsoft.com/office/drawing/2016/5/11/chartex" xmlns:cx6="http://schemas.microsoft.com/office/drawing/2016/5/12/chartex" xmlns:cx7="http://schemas.microsoft.com/office/drawing/2016/5/13/chartex" xmlns:cx8="http://schemas.microsoft.com/office/drawing/2016/5/14/chartex" xmlns:mc="http://schemas.openxmlformats.org/markup-compatibility/2006" xmlns:aink="http://schemas.microsoft.com/office/drawing/2016/ink" xmlns:am3d="http://schemas.microsoft.com/office/drawing/2017/model3d" xmlns:o="urn:schemas-microsoft-com:office:office" xmlns:oel="http://schemas.microsoft.com/office/2019/extlst" xmlns:r="http://schemas.openxmlformats.org/officeDocument/2006/relationships" xmlns:m="http://schemas.openxmlformats.org/officeDocument/2006/math" xmlns:v="urn:schemas-microsoft-com:vml" xmlns:wp14="http://schemas.microsoft.com/office/word/2010/wordprocessingDrawing" xmlns:wp="http://schemas.openxmlformats.org/drawingml/2006/wordprocessingDrawing" xmlns:w10="urn:schemas-microsoft-com:office:word" xmlns:w="http://schemas.openxmlformats.org/wordprocessingml/2006/main" xmlns:w14="http://schemas.microsoft.com/office/word/2010/wordml" xmlns:w15="http://schemas.microsoft.com/office/word/2012/wordml" xmlns:w16cex="http://schemas.microsoft.com/office/word/2018/wordml/cex" xmlns:w16cid="http://schemas.microsoft.com/office/word/2016/wordml/cid" xmlns:w16="http://schemas.microsoft.com/office/word/2018/wordml" xmlns:w16du="http://schemas.microsoft.com/office/word/2023/wordml/word16du" xmlns:w16sdtdh="http://schemas.microsoft.com/office/word/2020/wordml/sdtdatahash" xmlns:w16sdtfl="http://schemas.microsoft.com/office/word/2024/wordml/sdtformatlock" xmlns:w16se="http://schemas.microsoft.com/office/word/2015/wordml/symex" xmlns:wpg="http://schemas.microsoft.com/office/word/2010/wordprocessingGroup" xmlns:wpi="http://schemas.microsoft.com/office/word/2010/wordprocessingInk" xmlns:wne="http://schemas.microsoft.com/office/word/2006/wordml" xmlns:wps="http://schemas.microsoft.com/office/word/2010/wordprocessingShape" mc:Ignorable="w14 w15 w16se w16cid w16 w16cex w16sdtdh w16sdtfl w16du wp14">
   <w:footnote w:type="separator" w:id="-1">
     <w:p>
       <w:r>
@@ -3995,7 +5288,7 @@
 </file>
 
 <file path=word/numbering.xml><?xml version="1.0" encoding="utf-8"?>
-<w:numbering xmlns:wpc="http://schemas.microsoft.com/office/word/2010/wordprocessingCanvas" xmlns:cx="http://schemas.microsoft.com/office/drawing/2014/chartex" xmlns:cx1="http://schemas.microsoft.com/office/drawing/2015/9/8/chartex" xmlns:cx2="http://schemas.microsoft.com/office/drawing/2015/10/21/chartex" xmlns:cx3="http://schemas.microsoft.com/office/drawing/2016/5/9/chartex" xmlns:cx4="http://schemas.microsoft.com/office/drawing/2016/5/10/chartex" xmlns:cx5="http://schemas.microsoft.com/office/drawing/2016/5/11/chartex" xmlns:cx6="http://schemas.microsoft.com/office/drawing/2016/5/12/chartex" xmlns:cx7="http://schemas.microsoft.com/office/drawing/2016/5/13/chartex" xmlns:cx8="http://schemas.microsoft.com/office/drawing/2016/5/14/chartex" xmlns:mc="http://schemas.openxmlformats.org/markup-compatibility/2006" xmlns:aink="http://schemas.microsoft.com/office/drawing/2016/ink" xmlns:am3d="http://schemas.microsoft.com/office/drawing/2017/model3d" xmlns:o="urn:schemas-microsoft-com:office:office" xmlns:oel="http://schemas.microsoft.com/office/2019/extlst" xmlns:r="http://schemas.openxmlformats.org/officeDocument/2006/relationships" xmlns:m="http://schemas.openxmlformats.org/officeDocument/2006/math" xmlns:v="urn:schemas-microsoft-com:vml" xmlns:wp14="http://schemas.microsoft.com/office/word/2010/wordprocessingDrawing" xmlns:wp="http://schemas.openxmlformats.org/drawingml/2006/wordprocessingDrawing" xmlns:w10="urn:schemas-microsoft-com:office:word" xmlns:w="http://schemas.openxmlformats.org/wordprocessingml/2006/main" xmlns:w14="http://schemas.microsoft.com/office/word/2010/wordml" xmlns:w15="http://schemas.microsoft.com/office/word/2012/wordml" xmlns:w16cei="http://schemas.microsoft.com/office/word/2026/wordml/cei" xmlns:w16cex="http://schemas.microsoft.com/office/word/2018/wordml/cex" xmlns:w16cid="http://schemas.microsoft.com/office/word/2016/wordml/cid" xmlns:w16="http://schemas.microsoft.com/office/word/2018/wordml" xmlns:w16du="http://schemas.microsoft.com/office/word/2023/wordml/word16du" xmlns:w16sdtdh="http://schemas.microsoft.com/office/word/2020/wordml/sdtdatahash" xmlns:w16sdtfl="http://schemas.microsoft.com/office/word/2024/wordml/sdtformatlock" xmlns:w16se="http://schemas.microsoft.com/office/word/2015/wordml/symex" xmlns:wpg="http://schemas.microsoft.com/office/word/2010/wordprocessingGroup" xmlns:wpi="http://schemas.microsoft.com/office/word/2010/wordprocessingInk" xmlns:wne="http://schemas.microsoft.com/office/word/2006/wordml" xmlns:wps="http://schemas.microsoft.com/office/word/2010/wordprocessingShape" mc:Ignorable="w14 w15 w16se w16cid w16 w16cex w16sdtdh w16sdtfl w16du wp14">
+<w:numbering xmlns:wpc="http://schemas.microsoft.com/office/word/2010/wordprocessingCanvas" xmlns:cx="http://schemas.microsoft.com/office/drawing/2014/chartex" xmlns:cx1="http://schemas.microsoft.com/office/drawing/2015/9/8/chartex" xmlns:cx2="http://schemas.microsoft.com/office/drawing/2015/10/21/chartex" xmlns:cx3="http://schemas.microsoft.com/office/drawing/2016/5/9/chartex" xmlns:cx4="http://schemas.microsoft.com/office/drawing/2016/5/10/chartex" xmlns:cx5="http://schemas.microsoft.com/office/drawing/2016/5/11/chartex" xmlns:cx6="http://schemas.microsoft.com/office/drawing/2016/5/12/chartex" xmlns:cx7="http://schemas.microsoft.com/office/drawing/2016/5/13/chartex" xmlns:cx8="http://schemas.microsoft.com/office/drawing/2016/5/14/chartex" xmlns:mc="http://schemas.openxmlformats.org/markup-compatibility/2006" xmlns:aink="http://schemas.microsoft.com/office/drawing/2016/ink" xmlns:am3d="http://schemas.microsoft.com/office/drawing/2017/model3d" xmlns:o="urn:schemas-microsoft-com:office:office" xmlns:oel="http://schemas.microsoft.com/office/2019/extlst" xmlns:r="http://schemas.openxmlformats.org/officeDocument/2006/relationships" xmlns:m="http://schemas.openxmlformats.org/officeDocument/2006/math" xmlns:v="urn:schemas-microsoft-com:vml" xmlns:wp14="http://schemas.microsoft.com/office/word/2010/wordprocessingDrawing" xmlns:wp="http://schemas.openxmlformats.org/drawingml/2006/wordprocessingDrawing" xmlns:w10="urn:schemas-microsoft-com:office:word" xmlns:w="http://schemas.openxmlformats.org/wordprocessingml/2006/main" xmlns:w14="http://schemas.microsoft.com/office/word/2010/wordml" xmlns:w15="http://schemas.microsoft.com/office/word/2012/wordml" xmlns:w16cex="http://schemas.microsoft.com/office/word/2018/wordml/cex" xmlns:w16cid="http://schemas.microsoft.com/office/word/2016/wordml/cid" xmlns:w16="http://schemas.microsoft.com/office/word/2018/wordml" xmlns:w16du="http://schemas.microsoft.com/office/word/2023/wordml/word16du" xmlns:w16sdtdh="http://schemas.microsoft.com/office/word/2020/wordml/sdtdatahash" xmlns:w16sdtfl="http://schemas.microsoft.com/office/word/2024/wordml/sdtformatlock" xmlns:w16se="http://schemas.microsoft.com/office/word/2015/wordml/symex" xmlns:wpg="http://schemas.microsoft.com/office/word/2010/wordprocessingGroup" xmlns:wpi="http://schemas.microsoft.com/office/word/2010/wordprocessingInk" xmlns:wne="http://schemas.microsoft.com/office/word/2006/wordml" xmlns:wps="http://schemas.microsoft.com/office/word/2010/wordprocessingShape" mc:Ignorable="w14 w15 w16se w16cid w16 w16cex w16sdtdh w16sdtfl w16du wp14">
   <w:abstractNum w:abstractNumId="0" w15:restartNumberingAfterBreak="0">
     <w:nsid w:val="0000A990"/>
     <w:multiLevelType w:val="multilevel"/>

</xml_diff>